<commit_message>
docs(catalog): update AI audit log and test case specification
</commit_message>
<xml_diff>
--- a/docs/ai-audit/BE-03_AI_Audit_Log.docx
+++ b/docs/ai-audit/BE-03_AI_Audit_Log.docx
@@ -1090,6 +1090,306 @@
           </w:p>
         </w:tc>
       </w:tr>
+      <w:tr>
+        <w:tc>
+          <w:tcPr>
+            <w:tcW w:type="dxa" w:w="4680"/>
+          </w:tcPr>
+          <w:p>
+            <w:r>
+              <w:rPr>
+                <w:rFonts w:ascii="Calibri" w:hAnsi="Calibri"/>
+                <w:sz w:val="20"/>
+              </w:rPr>
+              <w:t>backend/src/main/resources/db/migration/catalog/V22__add_upgrade_tracking_to_member_card.sql</w:t>
+            </w:r>
+          </w:p>
+        </w:tc>
+        <w:tc>
+          <w:tcPr>
+            <w:tcW w:type="dxa" w:w="4680"/>
+          </w:tcPr>
+          <w:p>
+            <w:r>
+              <w:rPr>
+                <w:rFonts w:ascii="Calibri" w:hAnsi="Calibri"/>
+                <w:sz w:val="20"/>
+              </w:rPr>
+              <w:t>Added migration for explicit upgrade tracking with backfill</w:t>
+            </w:r>
+          </w:p>
+        </w:tc>
+      </w:tr>
+      <w:tr>
+        <w:tc>
+          <w:tcPr>
+            <w:tcW w:type="dxa" w:w="4680"/>
+          </w:tcPr>
+          <w:p>
+            <w:r>
+              <w:rPr>
+                <w:rFonts w:ascii="Calibri" w:hAnsi="Calibri"/>
+                <w:sz w:val="20"/>
+              </w:rPr>
+              <w:t>backend/src/main/java/com/sportify/catalog/entity/MemberCard.java</w:t>
+            </w:r>
+          </w:p>
+        </w:tc>
+        <w:tc>
+          <w:tcPr>
+            <w:tcW w:type="dxa" w:w="4680"/>
+          </w:tcPr>
+          <w:p>
+            <w:r>
+              <w:rPr>
+                <w:rFonts w:ascii="Calibri" w:hAnsi="Calibri"/>
+                <w:sz w:val="20"/>
+              </w:rPr>
+              <w:t>Added upgradeRequest and replacesCard entity mappings</w:t>
+            </w:r>
+          </w:p>
+        </w:tc>
+      </w:tr>
+      <w:tr>
+        <w:tc>
+          <w:tcPr>
+            <w:tcW w:type="dxa" w:w="4680"/>
+          </w:tcPr>
+          <w:p>
+            <w:r>
+              <w:rPr>
+                <w:rFonts w:ascii="Calibri" w:hAnsi="Calibri"/>
+                <w:sz w:val="20"/>
+              </w:rPr>
+              <w:t>docs/database/schema/02-catalog-and-membership.md</w:t>
+            </w:r>
+          </w:p>
+        </w:tc>
+        <w:tc>
+          <w:tcPr>
+            <w:tcW w:type="dxa" w:w="4680"/>
+          </w:tcPr>
+          <w:p>
+            <w:r>
+              <w:rPr>
+                <w:rFonts w:ascii="Calibri" w:hAnsi="Calibri"/>
+                <w:sz w:val="20"/>
+              </w:rPr>
+              <w:t>Documented upgrade tracking columns on member_card</w:t>
+            </w:r>
+          </w:p>
+        </w:tc>
+      </w:tr>
+      <w:tr>
+        <w:tc>
+          <w:tcPr>
+            <w:tcW w:type="dxa" w:w="4680"/>
+          </w:tcPr>
+          <w:p>
+            <w:r>
+              <w:rPr>
+                <w:rFonts w:ascii="Calibri" w:hAnsi="Calibri"/>
+                <w:sz w:val="20"/>
+              </w:rPr>
+              <w:t>docs/database/02-catalog-and-membership.md</w:t>
+            </w:r>
+          </w:p>
+        </w:tc>
+        <w:tc>
+          <w:tcPr>
+            <w:tcW w:type="dxa" w:w="4680"/>
+          </w:tcPr>
+          <w:p>
+            <w:r>
+              <w:rPr>
+                <w:rFonts w:ascii="Calibri" w:hAnsi="Calibri"/>
+                <w:sz w:val="20"/>
+              </w:rPr>
+              <w:t>Documented upgrade tracking columns on member_card</w:t>
+            </w:r>
+          </w:p>
+        </w:tc>
+      </w:tr>
+      <w:tr>
+        <w:tc>
+          <w:tcPr>
+            <w:tcW w:type="dxa" w:w="4680"/>
+          </w:tcPr>
+          <w:p>
+            <w:r>
+              <w:rPr>
+                <w:rFonts w:ascii="Calibri" w:hAnsi="Calibri"/>
+                <w:sz w:val="20"/>
+              </w:rPr>
+              <w:t>backend/src/test/java/com/sportify/catalog/controller/ManagerCatalogIntegrationTest.java</w:t>
+            </w:r>
+          </w:p>
+        </w:tc>
+        <w:tc>
+          <w:tcPr>
+            <w:tcW w:type="dxa" w:w="4680"/>
+          </w:tcPr>
+          <w:p>
+            <w:r>
+              <w:rPr>
+                <w:rFonts w:ascii="Calibri" w:hAnsi="Calibri"/>
+                <w:sz w:val="20"/>
+              </w:rPr>
+              <w:t>Added integration tests for catalog specifications, audit logging, and price snapshots</w:t>
+            </w:r>
+          </w:p>
+        </w:tc>
+      </w:tr>
+      <w:tr>
+        <w:tc>
+          <w:tcPr>
+            <w:tcW w:type="dxa" w:w="4680"/>
+          </w:tcPr>
+          <w:p>
+            <w:r>
+              <w:rPr>
+                <w:rFonts w:ascii="Calibri" w:hAnsi="Calibri"/>
+                <w:sz w:val="20"/>
+              </w:rPr>
+              <w:t>backend/src/main/resources/db/migration/catalog/V22__add_upgrade_tracking_to_member_card.sql</w:t>
+            </w:r>
+          </w:p>
+        </w:tc>
+        <w:tc>
+          <w:tcPr>
+            <w:tcW w:type="dxa" w:w="4680"/>
+          </w:tcPr>
+          <w:p>
+            <w:r>
+              <w:rPr>
+                <w:rFonts w:ascii="Calibri" w:hAnsi="Calibri"/>
+                <w:sz w:val="20"/>
+              </w:rPr>
+              <w:t>Added migration for explicit upgrade tracking with backfill</w:t>
+            </w:r>
+          </w:p>
+        </w:tc>
+      </w:tr>
+      <w:tr>
+        <w:tc>
+          <w:tcPr>
+            <w:tcW w:type="dxa" w:w="4680"/>
+          </w:tcPr>
+          <w:p>
+            <w:r>
+              <w:rPr>
+                <w:rFonts w:ascii="Calibri" w:hAnsi="Calibri"/>
+                <w:sz w:val="20"/>
+              </w:rPr>
+              <w:t>backend/src/main/java/com/sportify/catalog/entity/MemberCard.java</w:t>
+            </w:r>
+          </w:p>
+        </w:tc>
+        <w:tc>
+          <w:tcPr>
+            <w:tcW w:type="dxa" w:w="4680"/>
+          </w:tcPr>
+          <w:p>
+            <w:r>
+              <w:rPr>
+                <w:rFonts w:ascii="Calibri" w:hAnsi="Calibri"/>
+                <w:sz w:val="20"/>
+              </w:rPr>
+              <w:t>Added upgradeRequest and replacesCard entity mappings</w:t>
+            </w:r>
+          </w:p>
+        </w:tc>
+      </w:tr>
+      <w:tr>
+        <w:tc>
+          <w:tcPr>
+            <w:tcW w:type="dxa" w:w="4680"/>
+          </w:tcPr>
+          <w:p>
+            <w:r>
+              <w:rPr>
+                <w:rFonts w:ascii="Calibri" w:hAnsi="Calibri"/>
+                <w:sz w:val="20"/>
+              </w:rPr>
+              <w:t>docs/database/schema/02-catalog-and-membership.md</w:t>
+            </w:r>
+          </w:p>
+        </w:tc>
+        <w:tc>
+          <w:tcPr>
+            <w:tcW w:type="dxa" w:w="4680"/>
+          </w:tcPr>
+          <w:p>
+            <w:r>
+              <w:rPr>
+                <w:rFonts w:ascii="Calibri" w:hAnsi="Calibri"/>
+                <w:sz w:val="20"/>
+              </w:rPr>
+              <w:t>Documented upgrade tracking columns on member_card</w:t>
+            </w:r>
+          </w:p>
+        </w:tc>
+      </w:tr>
+      <w:tr>
+        <w:tc>
+          <w:tcPr>
+            <w:tcW w:type="dxa" w:w="4680"/>
+          </w:tcPr>
+          <w:p>
+            <w:r>
+              <w:rPr>
+                <w:rFonts w:ascii="Calibri" w:hAnsi="Calibri"/>
+                <w:sz w:val="20"/>
+              </w:rPr>
+              <w:t>docs/database/02-catalog-and-membership.md</w:t>
+            </w:r>
+          </w:p>
+        </w:tc>
+        <w:tc>
+          <w:tcPr>
+            <w:tcW w:type="dxa" w:w="4680"/>
+          </w:tcPr>
+          <w:p>
+            <w:r>
+              <w:rPr>
+                <w:rFonts w:ascii="Calibri" w:hAnsi="Calibri"/>
+                <w:sz w:val="20"/>
+              </w:rPr>
+              <w:t>Documented upgrade tracking columns on member_card</w:t>
+            </w:r>
+          </w:p>
+        </w:tc>
+      </w:tr>
+      <w:tr>
+        <w:tc>
+          <w:tcPr>
+            <w:tcW w:type="dxa" w:w="4680"/>
+          </w:tcPr>
+          <w:p>
+            <w:r>
+              <w:rPr>
+                <w:rFonts w:ascii="Calibri" w:hAnsi="Calibri"/>
+                <w:sz w:val="20"/>
+              </w:rPr>
+              <w:t>backend/src/test/java/com/sportify/catalog/controller/ManagerCatalogIntegrationTest.java</w:t>
+            </w:r>
+          </w:p>
+        </w:tc>
+        <w:tc>
+          <w:tcPr>
+            <w:tcW w:type="dxa" w:w="4680"/>
+          </w:tcPr>
+          <w:p>
+            <w:r>
+              <w:rPr>
+                <w:rFonts w:ascii="Calibri" w:hAnsi="Calibri"/>
+                <w:sz w:val="20"/>
+              </w:rPr>
+              <w:t>Added integration tests for catalog specifications, audit logging, and price snapshots</w:t>
+            </w:r>
+          </w:p>
+        </w:tc>
+      </w:tr>
     </w:tbl>
     <w:p>
       <w:pPr>
@@ -1177,7 +1477,19 @@
           <w:rFonts w:ascii="Calibri" w:hAnsi="Calibri"/>
           <w:sz w:val="21"/>
         </w:rPr>
-        <w:t>672 tests run, 0 failures, 0 errors, 96 skipped (Docker Testcontainers)</w:t>
+      </w:r>
+      <w:r>
+        <w:rPr>
+          <w:rFonts w:ascii="Calibri" w:hAnsi="Calibri"/>
+          <w:sz w:val="21"/>
+        </w:rPr>
+      </w:r>
+      <w:r>
+        <w:rPr>
+          <w:rFonts w:ascii="Calibri" w:hAnsi="Calibri"/>
+          <w:sz w:val="21"/>
+        </w:rPr>
+        <w:t>694 tests run, 0 failures, 0 errors, 100 skipped (Testcontainers integration tests skipped locally due to lack of Docker)</w:t>
       </w:r>
     </w:p>
     <w:p>
@@ -1307,17 +1619,63 @@
       <w:r>
         <w:rPr>
           <w:rFonts w:ascii="Calibri" w:hAnsi="Calibri"/>
-          <w:b/>
           <w:sz w:val="21"/>
         </w:rPr>
-        <w:t xml:space="preserve">Commit 4: </w:t>
+        <w:t>Commit 4: dbe924f - docs(catalog): add test case specification and AI audit log for BE-03</w:t>
       </w:r>
+    </w:p>
+    <w:p>
       <w:r>
         <w:rPr>
           <w:rFonts w:ascii="Calibri" w:hAnsi="Calibri"/>
           <w:sz w:val="21"/>
         </w:rPr>
-        <w:t>392f067 - docs(catalog): add test case specification and AI audit log for BE-03</w:t>
+        <w:t>Commit 5: f588ec5 - fix(card): enforce duration and standard tier invariants</w:t>
+      </w:r>
+    </w:p>
+    <w:p>
+      <w:r>
+        <w:rPr>
+          <w:rFonts w:ascii="Calibri" w:hAnsi="Calibri"/>
+          <w:sz w:val="21"/>
+        </w:rPr>
+        <w:t>Commit 6: ce20721 - fix(card): snapshot-safe upgrade pricing with migration and explicit tracking</w:t>
+      </w:r>
+    </w:p>
+    <w:p>
+      <w:r>
+        <w:rPr>
+          <w:rFonts w:ascii="Calibri" w:hAnsi="Calibri"/>
+          <w:sz w:val="21"/>
+        </w:rPr>
+        <w:t>Commit 7: 8b7faf7 - fix(catalog): add size and digits validation and full-replace description semantics</w:t>
+      </w:r>
+    </w:p>
+    <w:p>
+      <w:r>
+        <w:rPr>
+          <w:rFonts w:ascii="Calibri" w:hAnsi="Calibri"/>
+          <w:sz w:val="21"/>
+        </w:rPr>
+        <w:t>Commit 8: dce3300 - refactor(catalog): remove duplicate routes and redundant alias accessors</w:t>
+      </w:r>
+    </w:p>
+    <w:p>
+      <w:r>
+        <w:rPr>
+          <w:rFonts w:ascii="Calibri" w:hAnsi="Calibri"/>
+          <w:sz w:val="21"/>
+        </w:rPr>
+        <w:t>Commit 9: 0c38b37 - test(catalog): add integration and regression tests for manager catalog</w:t>
+      </w:r>
+    </w:p>
+    <w:p>
+      <w:r>
+        <w:rPr>
+          <w:rFonts w:ascii="Calibri" w:hAnsi="Calibri"/>
+          <w:sz w:val="21"/>
+        </w:rPr>
+        <w:t>Commit 10: docs(catalog): update AI audit log and test case specification</w:t>
       </w:r>
     </w:p>
     <w:p>
@@ -1363,17 +1721,3297 @@
       <w:r>
         <w:rPr>
           <w:rFonts w:ascii="Calibri" w:hAnsi="Calibri"/>
-          <w:b/>
           <w:sz w:val="21"/>
         </w:rPr>
-        <w:t xml:space="preserve">Open Issues: </w:t>
+        <w:t>Open Issues: Concurrent updates to packages and card tiers operate under last-write-wins semantics without entity versioning (@Version). Concurrent edits are last-write-wins, accepted risk, follow-up ticket recommended.</w:t>
       </w:r>
+    </w:p>
+    <w:p>
+      <w:r>
+        <w:rPr>
+          <w:rFonts w:ascii="Calibri" w:hAnsi="Calibri"/>
+          <w:b/>
+          <w:sz w:val="28"/>
+        </w:rPr>
+        <w:t>9. Review Fixes (Findings R-01 to R-13)</w:t>
+      </w:r>
+    </w:p>
+    <w:p>
       <w:r>
         <w:rPr>
           <w:rFonts w:ascii="Calibri" w:hAnsi="Calibri"/>
           <w:sz w:val="21"/>
         </w:rPr>
-        <w:t>None. All acceptance criteria and mandatory rules are fully met.</w:t>
+        <w:t>This section details the resolution of all thirteen review findings (R-01 through R-13) identified during the code review of branch feat/f1-manager-catalog.</w:t>
+      </w:r>
+    </w:p>
+    <w:tbl>
+      <w:tblPr>
+        <w:tblW w:type="auto" w:w="0"/>
+        <w:jc w:val="center"/>
+        <w:tblLook w:firstColumn="1" w:firstRow="1" w:lastColumn="0" w:lastRow="0" w:noHBand="0" w:noVBand="1" w:val="04A0"/>
+      </w:tblPr>
+      <w:tblGrid>
+        <w:gridCol w:w="1872"/>
+        <w:gridCol w:w="1872"/>
+        <w:gridCol w:w="1872"/>
+        <w:gridCol w:w="1872"/>
+        <w:gridCol w:w="1872"/>
+      </w:tblGrid>
+      <w:tr>
+        <w:tc>
+          <w:tcPr>
+            <w:tcW w:type="dxa" w:w="1872"/>
+          </w:tcPr>
+          <w:p>
+            <w:r>
+              <w:rPr>
+                <w:rFonts w:ascii="Calibri" w:hAnsi="Calibri"/>
+                <w:b/>
+                <w:sz w:val="20"/>
+              </w:rPr>
+              <w:t>ID</w:t>
+            </w:r>
+          </w:p>
+        </w:tc>
+        <w:tc>
+          <w:tcPr>
+            <w:tcW w:type="dxa" w:w="1872"/>
+          </w:tcPr>
+          <w:p>
+            <w:r>
+              <w:rPr>
+                <w:rFonts w:ascii="Calibri" w:hAnsi="Calibri"/>
+                <w:b/>
+                <w:sz w:val="20"/>
+              </w:rPr>
+              <w:t>Severity</w:t>
+            </w:r>
+          </w:p>
+        </w:tc>
+        <w:tc>
+          <w:tcPr>
+            <w:tcW w:type="dxa" w:w="1872"/>
+          </w:tcPr>
+          <w:p>
+            <w:r>
+              <w:rPr>
+                <w:rFonts w:ascii="Calibri" w:hAnsi="Calibri"/>
+                <w:b/>
+                <w:sz w:val="20"/>
+              </w:rPr>
+              <w:t>Title</w:t>
+            </w:r>
+          </w:p>
+        </w:tc>
+        <w:tc>
+          <w:tcPr>
+            <w:tcW w:type="dxa" w:w="1872"/>
+          </w:tcPr>
+          <w:p>
+            <w:r>
+              <w:rPr>
+                <w:rFonts w:ascii="Calibri" w:hAnsi="Calibri"/>
+                <w:b/>
+                <w:sz w:val="20"/>
+              </w:rPr>
+              <w:t>Status</w:t>
+            </w:r>
+          </w:p>
+        </w:tc>
+        <w:tc>
+          <w:tcPr>
+            <w:tcW w:type="dxa" w:w="1872"/>
+          </w:tcPr>
+          <w:p>
+            <w:r>
+              <w:rPr>
+                <w:rFonts w:ascii="Calibri" w:hAnsi="Calibri"/>
+                <w:b/>
+                <w:sz w:val="20"/>
+              </w:rPr>
+              <w:t>Commit</w:t>
+            </w:r>
+          </w:p>
+        </w:tc>
+      </w:tr>
+      <w:tr>
+        <w:tc>
+          <w:tcPr>
+            <w:tcW w:type="dxa" w:w="1872"/>
+          </w:tcPr>
+          <w:p>
+            <w:r>
+              <w:rPr>
+                <w:rFonts w:ascii="Calibri" w:hAnsi="Calibri"/>
+                <w:sz w:val="19"/>
+              </w:rPr>
+              <w:t>R-01</w:t>
+            </w:r>
+          </w:p>
+        </w:tc>
+        <w:tc>
+          <w:tcPr>
+            <w:tcW w:type="dxa" w:w="1872"/>
+          </w:tcPr>
+          <w:p>
+            <w:r>
+              <w:rPr>
+                <w:rFonts w:ascii="Calibri" w:hAnsi="Calibri"/>
+                <w:sz w:val="19"/>
+              </w:rPr>
+              <w:t>BLOCKER</w:t>
+            </w:r>
+          </w:p>
+        </w:tc>
+        <w:tc>
+          <w:tcPr>
+            <w:tcW w:type="dxa" w:w="1872"/>
+          </w:tcPr>
+          <w:p>
+            <w:r>
+              <w:rPr>
+                <w:rFonts w:ascii="Calibri" w:hAnsi="Calibri"/>
+                <w:sz w:val="19"/>
+              </w:rPr>
+              <w:t>Duration months hole and STANDARD invariant</w:t>
+            </w:r>
+          </w:p>
+        </w:tc>
+        <w:tc>
+          <w:tcPr>
+            <w:tcW w:type="dxa" w:w="1872"/>
+          </w:tcPr>
+          <w:p>
+            <w:r>
+              <w:rPr>
+                <w:rFonts w:ascii="Calibri" w:hAnsi="Calibri"/>
+                <w:sz w:val="19"/>
+              </w:rPr>
+              <w:t>Fixed</w:t>
+            </w:r>
+          </w:p>
+        </w:tc>
+        <w:tc>
+          <w:tcPr>
+            <w:tcW w:type="dxa" w:w="1872"/>
+          </w:tcPr>
+          <w:p>
+            <w:r>
+              <w:rPr>
+                <w:rFonts w:ascii="Calibri" w:hAnsi="Calibri"/>
+                <w:sz w:val="19"/>
+              </w:rPr>
+              <w:t>f588ec5</w:t>
+            </w:r>
+          </w:p>
+        </w:tc>
+      </w:tr>
+      <w:tr>
+        <w:tc>
+          <w:tcPr>
+            <w:tcW w:type="dxa" w:w="1872"/>
+          </w:tcPr>
+          <w:p>
+            <w:r>
+              <w:rPr>
+                <w:rFonts w:ascii="Calibri" w:hAnsi="Calibri"/>
+                <w:sz w:val="19"/>
+              </w:rPr>
+              <w:t>R-02</w:t>
+            </w:r>
+          </w:p>
+        </w:tc>
+        <w:tc>
+          <w:tcPr>
+            <w:tcW w:type="dxa" w:w="1872"/>
+          </w:tcPr>
+          <w:p>
+            <w:r>
+              <w:rPr>
+                <w:rFonts w:ascii="Calibri" w:hAnsi="Calibri"/>
+                <w:sz w:val="19"/>
+              </w:rPr>
+              <w:t>MAJOR</w:t>
+            </w:r>
+          </w:p>
+        </w:tc>
+        <w:tc>
+          <w:tcPr>
+            <w:tcW w:type="dxa" w:w="1872"/>
+          </w:tcPr>
+          <w:p>
+            <w:r>
+              <w:rPr>
+                <w:rFonts w:ascii="Calibri" w:hAnsi="Calibri"/>
+                <w:sz w:val="19"/>
+              </w:rPr>
+              <w:t>Cards retain old price and snapshot-safe upgrades</w:t>
+            </w:r>
+          </w:p>
+        </w:tc>
+        <w:tc>
+          <w:tcPr>
+            <w:tcW w:type="dxa" w:w="1872"/>
+          </w:tcPr>
+          <w:p>
+            <w:r>
+              <w:rPr>
+                <w:rFonts w:ascii="Calibri" w:hAnsi="Calibri"/>
+                <w:sz w:val="19"/>
+              </w:rPr>
+              <w:t>Fixed</w:t>
+            </w:r>
+          </w:p>
+        </w:tc>
+        <w:tc>
+          <w:tcPr>
+            <w:tcW w:type="dxa" w:w="1872"/>
+          </w:tcPr>
+          <w:p>
+            <w:r>
+              <w:rPr>
+                <w:rFonts w:ascii="Calibri" w:hAnsi="Calibri"/>
+                <w:sz w:val="19"/>
+              </w:rPr>
+              <w:t>ce20721</w:t>
+            </w:r>
+          </w:p>
+        </w:tc>
+      </w:tr>
+      <w:tr>
+        <w:tc>
+          <w:tcPr>
+            <w:tcW w:type="dxa" w:w="1872"/>
+          </w:tcPr>
+          <w:p>
+            <w:r>
+              <w:rPr>
+                <w:rFonts w:ascii="Calibri" w:hAnsi="Calibri"/>
+                <w:sz w:val="19"/>
+              </w:rPr>
+              <w:t>R-03</w:t>
+            </w:r>
+          </w:p>
+        </w:tc>
+        <w:tc>
+          <w:tcPr>
+            <w:tcW w:type="dxa" w:w="1872"/>
+          </w:tcPr>
+          <w:p>
+            <w:r>
+              <w:rPr>
+                <w:rFonts w:ascii="Calibri" w:hAnsi="Calibri"/>
+                <w:sz w:val="19"/>
+              </w:rPr>
+              <w:t>MAJOR</w:t>
+            </w:r>
+          </w:p>
+        </w:tc>
+        <w:tc>
+          <w:tcPr>
+            <w:tcW w:type="dxa" w:w="1872"/>
+          </w:tcPr>
+          <w:p>
+            <w:r>
+              <w:rPr>
+                <w:rFonts w:ascii="Calibri" w:hAnsi="Calibri"/>
+                <w:sz w:val="19"/>
+              </w:rPr>
+              <w:t>Explicit discount behavior for tiers and cards</w:t>
+            </w:r>
+          </w:p>
+        </w:tc>
+        <w:tc>
+          <w:tcPr>
+            <w:tcW w:type="dxa" w:w="1872"/>
+          </w:tcPr>
+          <w:p>
+            <w:r>
+              <w:rPr>
+                <w:rFonts w:ascii="Calibri" w:hAnsi="Calibri"/>
+                <w:sz w:val="19"/>
+              </w:rPr>
+              <w:t>Fixed</w:t>
+            </w:r>
+          </w:p>
+        </w:tc>
+        <w:tc>
+          <w:tcPr>
+            <w:tcW w:type="dxa" w:w="1872"/>
+          </w:tcPr>
+          <w:p>
+            <w:r>
+              <w:rPr>
+                <w:rFonts w:ascii="Calibri" w:hAnsi="Calibri"/>
+                <w:sz w:val="19"/>
+              </w:rPr>
+              <w:t>ce20721</w:t>
+            </w:r>
+          </w:p>
+        </w:tc>
+      </w:tr>
+      <w:tr>
+        <w:tc>
+          <w:tcPr>
+            <w:tcW w:type="dxa" w:w="1872"/>
+          </w:tcPr>
+          <w:p>
+            <w:r>
+              <w:rPr>
+                <w:rFonts w:ascii="Calibri" w:hAnsi="Calibri"/>
+                <w:sz w:val="19"/>
+              </w:rPr>
+              <w:t>R-04</w:t>
+            </w:r>
+          </w:p>
+        </w:tc>
+        <w:tc>
+          <w:tcPr>
+            <w:tcW w:type="dxa" w:w="1872"/>
+          </w:tcPr>
+          <w:p>
+            <w:r>
+              <w:rPr>
+                <w:rFonts w:ascii="Calibri" w:hAnsi="Calibri"/>
+                <w:sz w:val="19"/>
+              </w:rPr>
+              <w:t>MAJOR</w:t>
+            </w:r>
+          </w:p>
+        </w:tc>
+        <w:tc>
+          <w:tcPr>
+            <w:tcW w:type="dxa" w:w="1872"/>
+          </w:tcPr>
+          <w:p>
+            <w:r>
+              <w:rPr>
+                <w:rFonts w:ascii="Calibri" w:hAnsi="Calibri"/>
+                <w:sz w:val="19"/>
+              </w:rPr>
+              <w:t>Length and precision validation annotations</w:t>
+            </w:r>
+          </w:p>
+        </w:tc>
+        <w:tc>
+          <w:tcPr>
+            <w:tcW w:type="dxa" w:w="1872"/>
+          </w:tcPr>
+          <w:p>
+            <w:r>
+              <w:rPr>
+                <w:rFonts w:ascii="Calibri" w:hAnsi="Calibri"/>
+                <w:sz w:val="19"/>
+              </w:rPr>
+              <w:t>Fixed</w:t>
+            </w:r>
+          </w:p>
+        </w:tc>
+        <w:tc>
+          <w:tcPr>
+            <w:tcW w:type="dxa" w:w="1872"/>
+          </w:tcPr>
+          <w:p>
+            <w:r>
+              <w:rPr>
+                <w:rFonts w:ascii="Calibri" w:hAnsi="Calibri"/>
+                <w:sz w:val="19"/>
+              </w:rPr>
+              <w:t>8b7faf7</w:t>
+            </w:r>
+          </w:p>
+        </w:tc>
+      </w:tr>
+      <w:tr>
+        <w:tc>
+          <w:tcPr>
+            <w:tcW w:type="dxa" w:w="1872"/>
+          </w:tcPr>
+          <w:p>
+            <w:r>
+              <w:rPr>
+                <w:rFonts w:ascii="Calibri" w:hAnsi="Calibri"/>
+                <w:sz w:val="19"/>
+              </w:rPr>
+              <w:t>R-05</w:t>
+            </w:r>
+          </w:p>
+        </w:tc>
+        <w:tc>
+          <w:tcPr>
+            <w:tcW w:type="dxa" w:w="1872"/>
+          </w:tcPr>
+          <w:p>
+            <w:r>
+              <w:rPr>
+                <w:rFonts w:ascii="Calibri" w:hAnsi="Calibri"/>
+                <w:sz w:val="19"/>
+              </w:rPr>
+              <w:t>MAJOR</w:t>
+            </w:r>
+          </w:p>
+        </w:tc>
+        <w:tc>
+          <w:tcPr>
+            <w:tcW w:type="dxa" w:w="1872"/>
+          </w:tcPr>
+          <w:p>
+            <w:r>
+              <w:rPr>
+                <w:rFonts w:ascii="Calibri" w:hAnsi="Calibri"/>
+                <w:sz w:val="19"/>
+              </w:rPr>
+              <w:t>Real test evidence and integration test suite</w:t>
+            </w:r>
+          </w:p>
+        </w:tc>
+        <w:tc>
+          <w:tcPr>
+            <w:tcW w:type="dxa" w:w="1872"/>
+          </w:tcPr>
+          <w:p>
+            <w:r>
+              <w:rPr>
+                <w:rFonts w:ascii="Calibri" w:hAnsi="Calibri"/>
+                <w:sz w:val="19"/>
+              </w:rPr>
+              <w:t>Fixed</w:t>
+            </w:r>
+          </w:p>
+        </w:tc>
+        <w:tc>
+          <w:tcPr>
+            <w:tcW w:type="dxa" w:w="1872"/>
+          </w:tcPr>
+          <w:p>
+            <w:r>
+              <w:rPr>
+                <w:rFonts w:ascii="Calibri" w:hAnsi="Calibri"/>
+                <w:sz w:val="19"/>
+              </w:rPr>
+              <w:t>0c38b37</w:t>
+            </w:r>
+          </w:p>
+        </w:tc>
+      </w:tr>
+      <w:tr>
+        <w:tc>
+          <w:tcPr>
+            <w:tcW w:type="dxa" w:w="1872"/>
+          </w:tcPr>
+          <w:p>
+            <w:r>
+              <w:rPr>
+                <w:rFonts w:ascii="Calibri" w:hAnsi="Calibri"/>
+                <w:sz w:val="19"/>
+              </w:rPr>
+              <w:t>R-06</w:t>
+            </w:r>
+          </w:p>
+        </w:tc>
+        <w:tc>
+          <w:tcPr>
+            <w:tcW w:type="dxa" w:w="1872"/>
+          </w:tcPr>
+          <w:p>
+            <w:r>
+              <w:rPr>
+                <w:rFonts w:ascii="Calibri" w:hAnsi="Calibri"/>
+                <w:sz w:val="19"/>
+              </w:rPr>
+              <w:t>MEDIUM</w:t>
+            </w:r>
+          </w:p>
+        </w:tc>
+        <w:tc>
+          <w:tcPr>
+            <w:tcW w:type="dxa" w:w="1872"/>
+          </w:tcPr>
+          <w:p>
+            <w:r>
+              <w:rPr>
+                <w:rFonts w:ascii="Calibri" w:hAnsi="Calibri"/>
+                <w:sz w:val="19"/>
+              </w:rPr>
+              <w:t>Scope creep: duplicate routes and alias removal</w:t>
+            </w:r>
+          </w:p>
+        </w:tc>
+        <w:tc>
+          <w:tcPr>
+            <w:tcW w:type="dxa" w:w="1872"/>
+          </w:tcPr>
+          <w:p>
+            <w:r>
+              <w:rPr>
+                <w:rFonts w:ascii="Calibri" w:hAnsi="Calibri"/>
+                <w:sz w:val="19"/>
+              </w:rPr>
+              <w:t>Fixed</w:t>
+            </w:r>
+          </w:p>
+        </w:tc>
+        <w:tc>
+          <w:tcPr>
+            <w:tcW w:type="dxa" w:w="1872"/>
+          </w:tcPr>
+          <w:p>
+            <w:r>
+              <w:rPr>
+                <w:rFonts w:ascii="Calibri" w:hAnsi="Calibri"/>
+                <w:sz w:val="19"/>
+              </w:rPr>
+              <w:t>8b7faf7, dce3300</w:t>
+            </w:r>
+          </w:p>
+        </w:tc>
+      </w:tr>
+      <w:tr>
+        <w:tc>
+          <w:tcPr>
+            <w:tcW w:type="dxa" w:w="1872"/>
+          </w:tcPr>
+          <w:p>
+            <w:r>
+              <w:rPr>
+                <w:rFonts w:ascii="Calibri" w:hAnsi="Calibri"/>
+                <w:sz w:val="19"/>
+              </w:rPr>
+              <w:t>R-07</w:t>
+            </w:r>
+          </w:p>
+        </w:tc>
+        <w:tc>
+          <w:tcPr>
+            <w:tcW w:type="dxa" w:w="1872"/>
+          </w:tcPr>
+          <w:p>
+            <w:r>
+              <w:rPr>
+                <w:rFonts w:ascii="Calibri" w:hAnsi="Calibri"/>
+                <w:sz w:val="19"/>
+              </w:rPr>
+              <w:t>MEDIUM</w:t>
+            </w:r>
+          </w:p>
+        </w:tc>
+        <w:tc>
+          <w:tcPr>
+            <w:tcW w:type="dxa" w:w="1872"/>
+          </w:tcPr>
+          <w:p>
+            <w:r>
+              <w:rPr>
+                <w:rFonts w:ascii="Calibri" w:hAnsi="Calibri"/>
+                <w:sz w:val="19"/>
+              </w:rPr>
+              <w:t>Null actor ternary check removal in PUT handlers</w:t>
+            </w:r>
+          </w:p>
+        </w:tc>
+        <w:tc>
+          <w:tcPr>
+            <w:tcW w:type="dxa" w:w="1872"/>
+          </w:tcPr>
+          <w:p>
+            <w:r>
+              <w:rPr>
+                <w:rFonts w:ascii="Calibri" w:hAnsi="Calibri"/>
+                <w:sz w:val="19"/>
+              </w:rPr>
+              <w:t>Fixed</w:t>
+            </w:r>
+          </w:p>
+        </w:tc>
+        <w:tc>
+          <w:tcPr>
+            <w:tcW w:type="dxa" w:w="1872"/>
+          </w:tcPr>
+          <w:p>
+            <w:r>
+              <w:rPr>
+                <w:rFonts w:ascii="Calibri" w:hAnsi="Calibri"/>
+                <w:sz w:val="19"/>
+              </w:rPr>
+              <w:t>dce3300</w:t>
+            </w:r>
+          </w:p>
+        </w:tc>
+      </w:tr>
+      <w:tr>
+        <w:tc>
+          <w:tcPr>
+            <w:tcW w:type="dxa" w:w="1872"/>
+          </w:tcPr>
+          <w:p>
+            <w:r>
+              <w:rPr>
+                <w:rFonts w:ascii="Calibri" w:hAnsi="Calibri"/>
+                <w:sz w:val="19"/>
+              </w:rPr>
+              <w:t>R-08</w:t>
+            </w:r>
+          </w:p>
+        </w:tc>
+        <w:tc>
+          <w:tcPr>
+            <w:tcW w:type="dxa" w:w="1872"/>
+          </w:tcPr>
+          <w:p>
+            <w:r>
+              <w:rPr>
+                <w:rFonts w:ascii="Calibri" w:hAnsi="Calibri"/>
+                <w:sz w:val="19"/>
+              </w:rPr>
+              <w:t>MEDIUM</w:t>
+            </w:r>
+          </w:p>
+        </w:tc>
+        <w:tc>
+          <w:tcPr>
+            <w:tcW w:type="dxa" w:w="1872"/>
+          </w:tcPr>
+          <w:p>
+            <w:r>
+              <w:rPr>
+                <w:rFonts w:ascii="Calibri" w:hAnsi="Calibri"/>
+                <w:sz w:val="19"/>
+              </w:rPr>
+              <w:t>Single definition of STANDARD tier code and helper</w:t>
+            </w:r>
+          </w:p>
+        </w:tc>
+        <w:tc>
+          <w:tcPr>
+            <w:tcW w:type="dxa" w:w="1872"/>
+          </w:tcPr>
+          <w:p>
+            <w:r>
+              <w:rPr>
+                <w:rFonts w:ascii="Calibri" w:hAnsi="Calibri"/>
+                <w:sz w:val="19"/>
+              </w:rPr>
+              <w:t>Fixed</w:t>
+            </w:r>
+          </w:p>
+        </w:tc>
+        <w:tc>
+          <w:tcPr>
+            <w:tcW w:type="dxa" w:w="1872"/>
+          </w:tcPr>
+          <w:p>
+            <w:r>
+              <w:rPr>
+                <w:rFonts w:ascii="Calibri" w:hAnsi="Calibri"/>
+                <w:sz w:val="19"/>
+              </w:rPr>
+              <w:t>f588ec5</w:t>
+            </w:r>
+          </w:p>
+        </w:tc>
+      </w:tr>
+      <w:tr>
+        <w:tc>
+          <w:tcPr>
+            <w:tcW w:type="dxa" w:w="1872"/>
+          </w:tcPr>
+          <w:p>
+            <w:r>
+              <w:rPr>
+                <w:rFonts w:ascii="Calibri" w:hAnsi="Calibri"/>
+                <w:sz w:val="19"/>
+              </w:rPr>
+              <w:t>R-09</w:t>
+            </w:r>
+          </w:p>
+        </w:tc>
+        <w:tc>
+          <w:tcPr>
+            <w:tcW w:type="dxa" w:w="1872"/>
+          </w:tcPr>
+          <w:p>
+            <w:r>
+              <w:rPr>
+                <w:rFonts w:ascii="Calibri" w:hAnsi="Calibri"/>
+                <w:sz w:val="19"/>
+              </w:rPr>
+              <w:t>MINOR</w:t>
+            </w:r>
+          </w:p>
+        </w:tc>
+        <w:tc>
+          <w:tcPr>
+            <w:tcW w:type="dxa" w:w="1872"/>
+          </w:tcPr>
+          <w:p>
+            <w:r>
+              <w:rPr>
+                <w:rFonts w:ascii="Calibri" w:hAnsi="Calibri"/>
+                <w:sz w:val="19"/>
+              </w:rPr>
+              <w:t>Duplicated validation clean-up between DTO and service</w:t>
+            </w:r>
+          </w:p>
+        </w:tc>
+        <w:tc>
+          <w:tcPr>
+            <w:tcW w:type="dxa" w:w="1872"/>
+          </w:tcPr>
+          <w:p>
+            <w:r>
+              <w:rPr>
+                <w:rFonts w:ascii="Calibri" w:hAnsi="Calibri"/>
+                <w:sz w:val="19"/>
+              </w:rPr>
+              <w:t>Fixed</w:t>
+            </w:r>
+          </w:p>
+        </w:tc>
+        <w:tc>
+          <w:tcPr>
+            <w:tcW w:type="dxa" w:w="1872"/>
+          </w:tcPr>
+          <w:p>
+            <w:r>
+              <w:rPr>
+                <w:rFonts w:ascii="Calibri" w:hAnsi="Calibri"/>
+                <w:sz w:val="19"/>
+              </w:rPr>
+              <w:t>f588ec5, 8b7faf7</w:t>
+            </w:r>
+          </w:p>
+        </w:tc>
+      </w:tr>
+      <w:tr>
+        <w:tc>
+          <w:tcPr>
+            <w:tcW w:type="dxa" w:w="1872"/>
+          </w:tcPr>
+          <w:p>
+            <w:r>
+              <w:rPr>
+                <w:rFonts w:ascii="Calibri" w:hAnsi="Calibri"/>
+                <w:sz w:val="19"/>
+              </w:rPr>
+              <w:t>R-10</w:t>
+            </w:r>
+          </w:p>
+        </w:tc>
+        <w:tc>
+          <w:tcPr>
+            <w:tcW w:type="dxa" w:w="1872"/>
+          </w:tcPr>
+          <w:p>
+            <w:r>
+              <w:rPr>
+                <w:rFonts w:ascii="Calibri" w:hAnsi="Calibri"/>
+                <w:sz w:val="19"/>
+              </w:rPr>
+              <w:t>MINOR</w:t>
+            </w:r>
+          </w:p>
+        </w:tc>
+        <w:tc>
+          <w:tcPr>
+            <w:tcW w:type="dxa" w:w="1872"/>
+          </w:tcPr>
+          <w:p>
+            <w:r>
+              <w:rPr>
+                <w:rFonts w:ascii="Calibri" w:hAnsi="Calibri"/>
+                <w:sz w:val="19"/>
+              </w:rPr>
+              <w:t>Optimistic locking documentation as accepted risk</w:t>
+            </w:r>
+          </w:p>
+        </w:tc>
+        <w:tc>
+          <w:tcPr>
+            <w:tcW w:type="dxa" w:w="1872"/>
+          </w:tcPr>
+          <w:p>
+            <w:r>
+              <w:rPr>
+                <w:rFonts w:ascii="Calibri" w:hAnsi="Calibri"/>
+                <w:sz w:val="19"/>
+              </w:rPr>
+              <w:t>Accepted Risk</w:t>
+            </w:r>
+          </w:p>
+        </w:tc>
+        <w:tc>
+          <w:tcPr>
+            <w:tcW w:type="dxa" w:w="1872"/>
+          </w:tcPr>
+          <w:p>
+            <w:r>
+              <w:rPr>
+                <w:rFonts w:ascii="Calibri" w:hAnsi="Calibri"/>
+                <w:sz w:val="19"/>
+              </w:rPr>
+              <w:t>docs commit</w:t>
+            </w:r>
+          </w:p>
+        </w:tc>
+      </w:tr>
+      <w:tr>
+        <w:tc>
+          <w:tcPr>
+            <w:tcW w:type="dxa" w:w="1872"/>
+          </w:tcPr>
+          <w:p>
+            <w:r>
+              <w:rPr>
+                <w:rFonts w:ascii="Calibri" w:hAnsi="Calibri"/>
+                <w:sz w:val="19"/>
+              </w:rPr>
+              <w:t>R-11</w:t>
+            </w:r>
+          </w:p>
+        </w:tc>
+        <w:tc>
+          <w:tcPr>
+            <w:tcW w:type="dxa" w:w="1872"/>
+          </w:tcPr>
+          <w:p>
+            <w:r>
+              <w:rPr>
+                <w:rFonts w:ascii="Calibri" w:hAnsi="Calibri"/>
+                <w:sz w:val="19"/>
+              </w:rPr>
+              <w:t>MINOR</w:t>
+            </w:r>
+          </w:p>
+        </w:tc>
+        <w:tc>
+          <w:tcPr>
+            <w:tcW w:type="dxa" w:w="1872"/>
+          </w:tcPr>
+          <w:p>
+            <w:r>
+              <w:rPr>
+                <w:rFonts w:ascii="Calibri" w:hAnsi="Calibri"/>
+                <w:sz w:val="19"/>
+              </w:rPr>
+              <w:t>PUT description full-replace semantics</w:t>
+            </w:r>
+          </w:p>
+        </w:tc>
+        <w:tc>
+          <w:tcPr>
+            <w:tcW w:type="dxa" w:w="1872"/>
+          </w:tcPr>
+          <w:p>
+            <w:r>
+              <w:rPr>
+                <w:rFonts w:ascii="Calibri" w:hAnsi="Calibri"/>
+                <w:sz w:val="19"/>
+              </w:rPr>
+              <w:t>Fixed</w:t>
+            </w:r>
+          </w:p>
+        </w:tc>
+        <w:tc>
+          <w:tcPr>
+            <w:tcW w:type="dxa" w:w="1872"/>
+          </w:tcPr>
+          <w:p>
+            <w:r>
+              <w:rPr>
+                <w:rFonts w:ascii="Calibri" w:hAnsi="Calibri"/>
+                <w:sz w:val="19"/>
+              </w:rPr>
+              <w:t>8b7faf7</w:t>
+            </w:r>
+          </w:p>
+        </w:tc>
+      </w:tr>
+      <w:tr>
+        <w:tc>
+          <w:tcPr>
+            <w:tcW w:type="dxa" w:w="1872"/>
+          </w:tcPr>
+          <w:p>
+            <w:r>
+              <w:rPr>
+                <w:rFonts w:ascii="Calibri" w:hAnsi="Calibri"/>
+                <w:sz w:val="19"/>
+              </w:rPr>
+              <w:t>R-12</w:t>
+            </w:r>
+          </w:p>
+        </w:tc>
+        <w:tc>
+          <w:tcPr>
+            <w:tcW w:type="dxa" w:w="1872"/>
+          </w:tcPr>
+          <w:p>
+            <w:r>
+              <w:rPr>
+                <w:rFonts w:ascii="Calibri" w:hAnsi="Calibri"/>
+                <w:sz w:val="19"/>
+              </w:rPr>
+              <w:t>NIT</w:t>
+            </w:r>
+          </w:p>
+        </w:tc>
+        <w:tc>
+          <w:tcPr>
+            <w:tcW w:type="dxa" w:w="1872"/>
+          </w:tcPr>
+          <w:p>
+            <w:r>
+              <w:rPr>
+                <w:rFonts w:ascii="Calibri" w:hAnsi="Calibri"/>
+                <w:sz w:val="19"/>
+              </w:rPr>
+              <w:t>Direct TrainingFormat binding and import order tidy</w:t>
+            </w:r>
+          </w:p>
+        </w:tc>
+        <w:tc>
+          <w:tcPr>
+            <w:tcW w:type="dxa" w:w="1872"/>
+          </w:tcPr>
+          <w:p>
+            <w:r>
+              <w:rPr>
+                <w:rFonts w:ascii="Calibri" w:hAnsi="Calibri"/>
+                <w:sz w:val="19"/>
+              </w:rPr>
+              <w:t>Fixed</w:t>
+            </w:r>
+          </w:p>
+        </w:tc>
+        <w:tc>
+          <w:tcPr>
+            <w:tcW w:type="dxa" w:w="1872"/>
+          </w:tcPr>
+          <w:p>
+            <w:r>
+              <w:rPr>
+                <w:rFonts w:ascii="Calibri" w:hAnsi="Calibri"/>
+                <w:sz w:val="19"/>
+              </w:rPr>
+              <w:t>dce3300</w:t>
+            </w:r>
+          </w:p>
+        </w:tc>
+      </w:tr>
+      <w:tr>
+        <w:tc>
+          <w:tcPr>
+            <w:tcW w:type="dxa" w:w="1872"/>
+          </w:tcPr>
+          <w:p>
+            <w:r>
+              <w:rPr>
+                <w:rFonts w:ascii="Calibri" w:hAnsi="Calibri"/>
+                <w:sz w:val="19"/>
+              </w:rPr>
+              <w:t>R-13</w:t>
+            </w:r>
+          </w:p>
+        </w:tc>
+        <w:tc>
+          <w:tcPr>
+            <w:tcW w:type="dxa" w:w="1872"/>
+          </w:tcPr>
+          <w:p>
+            <w:r>
+              <w:rPr>
+                <w:rFonts w:ascii="Calibri" w:hAnsi="Calibri"/>
+                <w:sz w:val="19"/>
+              </w:rPr>
+              <w:t>DOC</w:t>
+            </w:r>
+          </w:p>
+        </w:tc>
+        <w:tc>
+          <w:tcPr>
+            <w:tcW w:type="dxa" w:w="1872"/>
+          </w:tcPr>
+          <w:p>
+            <w:r>
+              <w:rPr>
+                <w:rFonts w:ascii="Calibri" w:hAnsi="Calibri"/>
+                <w:sz w:val="19"/>
+              </w:rPr>
+              <w:t>Documentation stale hash and open issues update</w:t>
+            </w:r>
+          </w:p>
+        </w:tc>
+        <w:tc>
+          <w:tcPr>
+            <w:tcW w:type="dxa" w:w="1872"/>
+          </w:tcPr>
+          <w:p>
+            <w:r>
+              <w:rPr>
+                <w:rFonts w:ascii="Calibri" w:hAnsi="Calibri"/>
+                <w:sz w:val="19"/>
+              </w:rPr>
+              <w:t>Fixed</w:t>
+            </w:r>
+          </w:p>
+        </w:tc>
+        <w:tc>
+          <w:tcPr>
+            <w:tcW w:type="dxa" w:w="1872"/>
+          </w:tcPr>
+          <w:p>
+            <w:r>
+              <w:rPr>
+                <w:rFonts w:ascii="Calibri" w:hAnsi="Calibri"/>
+                <w:sz w:val="19"/>
+              </w:rPr>
+              <w:t>docs commit</w:t>
+            </w:r>
+          </w:p>
+        </w:tc>
+      </w:tr>
+    </w:tbl>
+    <w:p>
+      <w:r>
+        <w:rPr>
+          <w:rFonts w:ascii="Calibri" w:hAnsi="Calibri"/>
+          <w:b/>
+          <w:sz w:val="24"/>
+        </w:rPr>
+        <w:t>R-01 (BLOCKER): Duration months hole</w:t>
+      </w:r>
+    </w:p>
+    <w:p>
+      <w:r>
+        <w:rPr>
+          <w:rFonts w:ascii="Calibri" w:hAnsi="Calibri"/>
+          <w:sz w:val="20"/>
+        </w:rPr>
+        <w:t>Problem: purchaseCard treated any tier with durationMonths &lt;= 0 as free and permanent, creating an ACTIVE card without requiring payment. updateTier also accepted durationMonths 0 for paid tiers and allowed changing STANDARD durationMonths.</w:t>
+      </w:r>
+    </w:p>
+    <w:p>
+      <w:r>
+        <w:rPr>
+          <w:rFonts w:ascii="Calibri" w:hAnsi="Calibri"/>
+          <w:sz w:val="20"/>
+        </w:rPr>
+        <w:t>Fix: Enforced durationMonths &gt;= 1 on paid tiers in DTO (@Min(1)) and service (HTTP 400). Enforced STANDARD durationMonths == 0 in service (HTTP 400). Unified STANDARD checks via isStandard(tier) helper. In purchaseCard, only tiers satisfying isStandard(tier) receive free permanent ACTIVE cards.</w:t>
+      </w:r>
+    </w:p>
+    <w:p>
+      <w:r>
+        <w:rPr>
+          <w:rFonts w:ascii="Calibri" w:hAnsi="Calibri"/>
+          <w:sz w:val="20"/>
+        </w:rPr>
+        <w:t>Files touched: backend/src/main/java/com/sportify/catalog/dto/MembershipCardTierUpdateRequest.java, backend/src/main/java/com/sportify/catalog/service/impl/MembershipCardServiceImpl.java, backend/src/test/java/com/sportify/catalog/service/MembershipCardServiceImplTest.java.</w:t>
+      </w:r>
+    </w:p>
+    <w:p>
+      <w:r>
+        <w:rPr>
+          <w:rFonts w:ascii="Calibri" w:hAnsi="Calibri"/>
+          <w:sz w:val="20"/>
+        </w:rPr>
+        <w:t>Commit: f588ec5.</w:t>
+      </w:r>
+    </w:p>
+    <w:p>
+      <w:r>
+        <w:rPr>
+          <w:rFonts w:ascii="Calibri" w:hAnsi="Calibri"/>
+          <w:b/>
+          <w:sz w:val="24"/>
+        </w:rPr>
+        <w:t>R-02 (MAJOR): Cards must keep their old price</w:t>
+      </w:r>
+    </w:p>
+    <w:p>
+      <w:r>
+        <w:rPr>
+          <w:rFonts w:ascii="Calibri" w:hAnsi="Calibri"/>
+          <w:sz w:val="20"/>
+        </w:rPr>
+        <w:t>Problem: (a) activateCard compared card.pricePaid with live tier price to detect upgrades; after manager raised tier price, pending cards created at old prices threw 'The member card has changed since this request'. (b) planCard computed upgrade difference from live tier price instead of actual price paid.</w:t>
+      </w:r>
+    </w:p>
+    <w:p>
+      <w:r>
+        <w:rPr>
+          <w:rFonts w:ascii="Calibri" w:hAnsi="Calibri"/>
+          <w:sz w:val="20"/>
+        </w:rPr>
+        <w:t>Decision &amp; Fix: Upgrade base decision: Upgrade difference is calculated from current.getPricePaid(), and for cards that were themselves upgrades, from calculateTermBasePrice(current) which accumulates pricePaid recursively across the replacement chain. This ensures fair pricing regardless of intermediate upgrades. Added explicit upgrade marker upgrade_request BIT NOT NULL DEFAULT 0 and replaces_card_id BIGINT NULL FK on member_card via Flyway migration V22__add_upgrade_tracking_to_member_card.sql with safe backfill. Updated MemberCard entity, purchase flow, and activation flow.</w:t>
+      </w:r>
+    </w:p>
+    <w:p>
+      <w:r>
+        <w:rPr>
+          <w:rFonts w:ascii="Calibri" w:hAnsi="Calibri"/>
+          <w:sz w:val="20"/>
+        </w:rPr>
+        <w:t>Files touched: backend/src/main/resources/db/migration/catalog/V22__add_upgrade_tracking_to_member_card.sql, backend/src/main/java/com/sportify/catalog/entity/MemberCard.java, backend/src/main/java/com/sportify/catalog/service/impl/MembershipCardServiceImpl.java, backend/src/test/java/com/sportify/catalog/service/MembershipCardServiceImplTest.java, docs/database/schema/02-catalog-and-membership.md, docs/database/02-catalog-and-membership.md.</w:t>
+      </w:r>
+    </w:p>
+    <w:p>
+      <w:r>
+        <w:rPr>
+          <w:rFonts w:ascii="Calibri" w:hAnsi="Calibri"/>
+          <w:sz w:val="20"/>
+        </w:rPr>
+        <w:t>Commit: ce20721.</w:t>
+      </w:r>
+    </w:p>
+    <w:p>
+      <w:r>
+        <w:rPr>
+          <w:rFonts w:ascii="Calibri" w:hAnsi="Calibri"/>
+          <w:b/>
+          <w:sz w:val="24"/>
+        </w:rPr>
+        <w:t>R-03 (MAJOR): Discount behavior must be explicit</w:t>
+      </w:r>
+    </w:p>
+    <w:p>
+      <w:r>
+        <w:rPr>
+          <w:rFonts w:ascii="Calibri" w:hAnsi="Calibri"/>
+          <w:sz w:val="20"/>
+        </w:rPr>
+        <w:t>Decision &amp; Fix: Policy decision: benefits follow the tier. Active cardholders enjoy the CURRENT discountPercentage of their tier for new registrations. Existing package registrations snapshot originalPrice, discountPercentage, and paidAmount at registration time and are never recalculated. Documented explicitly in code comments on getApplicableDiscountPercentage, in the AI Audit Log, and in test cases.</w:t>
+      </w:r>
+    </w:p>
+    <w:p>
+      <w:r>
+        <w:rPr>
+          <w:rFonts w:ascii="Calibri" w:hAnsi="Calibri"/>
+          <w:sz w:val="20"/>
+        </w:rPr>
+        <w:t>Files touched: backend/src/main/java/com/sportify/catalog/service/impl/MembershipCardServiceImpl.java, backend/src/test/java/com/sportify/catalog/service/MembershipCardServiceImplTest.java.</w:t>
+      </w:r>
+    </w:p>
+    <w:p>
+      <w:r>
+        <w:rPr>
+          <w:rFonts w:ascii="Calibri" w:hAnsi="Calibri"/>
+          <w:sz w:val="20"/>
+        </w:rPr>
+        <w:t>Commit: ce20721.</w:t>
+      </w:r>
+    </w:p>
+    <w:p>
+      <w:r>
+        <w:rPr>
+          <w:rFonts w:ascii="Calibri" w:hAnsi="Calibri"/>
+          <w:b/>
+          <w:sz w:val="24"/>
+        </w:rPr>
+        <w:t>R-04 (MAJOR): Length and precision validation</w:t>
+      </w:r>
+    </w:p>
+    <w:p>
+      <w:r>
+        <w:rPr>
+          <w:rFonts w:ascii="Calibri" w:hAnsi="Calibri"/>
+          <w:sz w:val="20"/>
+        </w:rPr>
+        <w:t>Problem: Update DTOs lacked character length and numeric precision validation annotations.</w:t>
+      </w:r>
+    </w:p>
+    <w:p>
+      <w:r>
+        <w:rPr>
+          <w:rFonts w:ascii="Calibri" w:hAnsi="Calibri"/>
+          <w:sz w:val="20"/>
+        </w:rPr>
+        <w:t>Fix: Added @Size(max = 50) on tier name, @Size(max = 100) on package name, @Size(max = 500) on description, @Digits(integer = 12, fraction = 2) on price, and @DecimalMin('0.00') on tier price in both update DTOs. Paid tier price &gt; 0 is enforced in service layer to permit STANDARD price 0.</w:t>
+      </w:r>
+    </w:p>
+    <w:p>
+      <w:r>
+        <w:rPr>
+          <w:rFonts w:ascii="Calibri" w:hAnsi="Calibri"/>
+          <w:sz w:val="20"/>
+        </w:rPr>
+        <w:t>Files touched: backend/src/main/java/com/sportify/catalog/dto/SportPackageUpdateRequest.java, backend/src/main/java/com/sportify/catalog/dto/MembershipCardTierUpdateRequest.java, backend/src/test/java/com/sportify/catalog/controller/ManagerPackageControllerTest.java, backend/src/test/java/com/sportify/catalog/controller/ManagerCardTierControllerTest.java.</w:t>
+      </w:r>
+    </w:p>
+    <w:p>
+      <w:r>
+        <w:rPr>
+          <w:rFonts w:ascii="Calibri" w:hAnsi="Calibri"/>
+          <w:sz w:val="20"/>
+        </w:rPr>
+        <w:t>Commit: 8b7faf7.</w:t>
+      </w:r>
+    </w:p>
+    <w:p>
+      <w:r>
+        <w:rPr>
+          <w:rFonts w:ascii="Calibri" w:hAnsi="Calibri"/>
+          <w:b/>
+          <w:sz w:val="24"/>
+        </w:rPr>
+        <w:t>R-05 (MAJOR): Real test evidence and integration tests</w:t>
+      </w:r>
+    </w:p>
+    <w:p>
+      <w:r>
+        <w:rPr>
+          <w:rFonts w:ascii="Calibri" w:hAnsi="Calibri"/>
+          <w:sz w:val="20"/>
+        </w:rPr>
+        <w:t>Problem: Missing integration test coverage for catalog filters, audit logging, and price snapshots; unit tests asserted only mock interactions.</w:t>
+      </w:r>
+    </w:p>
+    <w:p>
+      <w:r>
+        <w:rPr>
+          <w:rFonts w:ascii="Calibri" w:hAnsi="Calibri"/>
+          <w:sz w:val="20"/>
+        </w:rPr>
+        <w:t>Fix: Created ManagerCatalogIntegrationTest extending AbstractIntegrationTest covering: (1) SportPackageSpecifications filters (sportId, format, active, no filter, combined); (2) package update persistence with activity_log before/after snapshot; (3) tier update persistence with activity_log before/after snapshot; (4) end-to-end historical price snapshot preservation across package and tier price updates. Strengthened unit tests in SportPackageServiceImplTest and MembershipCardServiceImplTest with verifyNoInteractions.</w:t>
+      </w:r>
+    </w:p>
+    <w:p>
+      <w:r>
+        <w:rPr>
+          <w:rFonts w:ascii="Calibri" w:hAnsi="Calibri"/>
+          <w:sz w:val="20"/>
+        </w:rPr>
+        <w:t>Test status: Locally skipped due to lack of Docker daemon; verified to skip cleanly with 0 failures.</w:t>
+      </w:r>
+    </w:p>
+    <w:p>
+      <w:r>
+        <w:rPr>
+          <w:rFonts w:ascii="Calibri" w:hAnsi="Calibri"/>
+          <w:sz w:val="20"/>
+        </w:rPr>
+        <w:t>Files touched: backend/src/test/java/com/sportify/catalog/controller/ManagerCatalogIntegrationTest.java, backend/src/test/java/com/sportify/catalog/service/SportPackageServiceImplTest.java, backend/src/test/java/com/sportify/catalog/service/MembershipCardServiceImplTest.java.</w:t>
+      </w:r>
+    </w:p>
+    <w:p>
+      <w:r>
+        <w:rPr>
+          <w:rFonts w:ascii="Calibri" w:hAnsi="Calibri"/>
+          <w:sz w:val="20"/>
+        </w:rPr>
+        <w:t>Commit: 0c38b37.</w:t>
+      </w:r>
+    </w:p>
+    <w:p>
+      <w:r>
+        <w:rPr>
+          <w:rFonts w:ascii="Calibri" w:hAnsi="Calibri"/>
+          <w:b/>
+          <w:sz w:val="24"/>
+        </w:rPr>
+        <w:t>R-06 (MEDIUM): Scope creep removal</w:t>
+      </w:r>
+    </w:p>
+    <w:p>
+      <w:r>
+        <w:rPr>
+          <w:rFonts w:ascii="Calibri" w:hAnsi="Calibri"/>
+          <w:sz w:val="20"/>
+        </w:rPr>
+        <w:t>Problem: Redundant routes PUT /api/v1/manager/packages/{id} and PUT /api/v1/manager/card-tiers/{id}, alias accessors, and extra editable fields.</w:t>
+      </w:r>
+    </w:p>
+    <w:p>
+      <w:r>
+        <w:rPr>
+          <w:rFonts w:ascii="Calibri" w:hAnsi="Calibri"/>
+          <w:sz w:val="20"/>
+        </w:rPr>
+        <w:t>Fix: Removed duplicate PUT routes from ManagerPackageController and ManagerCardTierController. Removed alias accessors (getIsActive, setIsActive, getPriceAmount, setPriceAmount) and @JsonAlias from DTOs. Frontend scanned: no consumers of removed routes or accessors found. Tier name and package description editing were kept because they are required by Figma overlay screens F1-02 and F1-03 (documented in docs/database/13-figma-schema-gap-analysis.md).</w:t>
+      </w:r>
+    </w:p>
+    <w:p>
+      <w:r>
+        <w:rPr>
+          <w:rFonts w:ascii="Calibri" w:hAnsi="Calibri"/>
+          <w:sz w:val="20"/>
+        </w:rPr>
+        <w:t>Files touched: backend/src/main/java/com/sportify/catalog/controller/ManagerPackageController.java, backend/src/main/java/com/sportify/catalog/controller/ManagerCardTierController.java, backend/src/main/java/com/sportify/catalog/dto/SportPackageUpdateRequest.java, backend/src/main/java/com/sportify/catalog/dto/MembershipCardTierUpdateRequest.java, backend/src/test/java/com/sportify/catalog/controller/ManagerPackageControllerTest.java, backend/src/test/java/com/sportify/catalog/controller/ManagerCardTierControllerTest.java.</w:t>
+      </w:r>
+    </w:p>
+    <w:p>
+      <w:r>
+        <w:rPr>
+          <w:rFonts w:ascii="Calibri" w:hAnsi="Calibri"/>
+          <w:sz w:val="20"/>
+        </w:rPr>
+        <w:t>Commit: 8b7faf7, dce3300.</w:t>
+      </w:r>
+    </w:p>
+    <w:p>
+      <w:r>
+        <w:rPr>
+          <w:rFonts w:ascii="Calibri" w:hAnsi="Calibri"/>
+          <w:b/>
+          <w:sz w:val="24"/>
+        </w:rPr>
+        <w:t>R-07 (MEDIUM): Null actor ternary check removal</w:t>
+      </w:r>
+    </w:p>
+    <w:p>
+      <w:r>
+        <w:rPr>
+          <w:rFonts w:ascii="Calibri" w:hAnsi="Calibri"/>
+          <w:sz w:val="20"/>
+        </w:rPr>
+        <w:t>Problem: Ternary check userDetails != null ? userDetails.getUserAccount() : null in PUT handlers was redundant since Spring Security guarantees authenticated principal for secured routes.</w:t>
+      </w:r>
+    </w:p>
+    <w:p>
+      <w:r>
+        <w:rPr>
+          <w:rFonts w:ascii="Calibri" w:hAnsi="Calibri"/>
+          <w:sz w:val="20"/>
+        </w:rPr>
+        <w:t>Fix: Replaced with userDetails.getUserAccount() in SportPackageController and MembershipCardController.</w:t>
+      </w:r>
+    </w:p>
+    <w:p>
+      <w:r>
+        <w:rPr>
+          <w:rFonts w:ascii="Calibri" w:hAnsi="Calibri"/>
+          <w:sz w:val="20"/>
+        </w:rPr>
+        <w:t>Files touched: backend/src/main/java/com/sportify/catalog/controller/SportPackageController.java, backend/src/main/java/com/sportify/catalog/controller/MembershipCardController.java.</w:t>
+      </w:r>
+    </w:p>
+    <w:p>
+      <w:r>
+        <w:rPr>
+          <w:rFonts w:ascii="Calibri" w:hAnsi="Calibri"/>
+          <w:sz w:val="20"/>
+        </w:rPr>
+        <w:t>Commit: dce3300.</w:t>
+      </w:r>
+    </w:p>
+    <w:p>
+      <w:r>
+        <w:rPr>
+          <w:rFonts w:ascii="Calibri" w:hAnsi="Calibri"/>
+          <w:b/>
+          <w:sz w:val="24"/>
+        </w:rPr>
+        <w:t>R-08 (MEDIUM): Single definition of STANDARD</w:t>
+      </w:r>
+    </w:p>
+    <w:p>
+      <w:r>
+        <w:rPr>
+          <w:rFonts w:ascii="Calibri" w:hAnsi="Calibri"/>
+          <w:sz w:val="20"/>
+        </w:rPr>
+        <w:t>Problem: Inconsistent hardcoded 'STANDARD' tier checks across card service methods.</w:t>
+      </w:r>
+    </w:p>
+    <w:p>
+      <w:r>
+        <w:rPr>
+          <w:rFonts w:ascii="Calibri" w:hAnsi="Calibri"/>
+          <w:sz w:val="20"/>
+        </w:rPr>
+        <w:t>Fix: Introduced STANDARD_TIER_CODE = 'STANDARD' constant and private helper isStandard(tier). Applied across updateTier and purchaseCard to guarantee invariants (STANDARD durationMonths 0, price 0; paid tiers durationMonths &gt;= 1).</w:t>
+      </w:r>
+    </w:p>
+    <w:p>
+      <w:r>
+        <w:rPr>
+          <w:rFonts w:ascii="Calibri" w:hAnsi="Calibri"/>
+          <w:sz w:val="20"/>
+        </w:rPr>
+        <w:t>Files touched: backend/src/main/java/com/sportify/catalog/service/impl/MembershipCardServiceImpl.java.</w:t>
+      </w:r>
+    </w:p>
+    <w:p>
+      <w:r>
+        <w:rPr>
+          <w:rFonts w:ascii="Calibri" w:hAnsi="Calibri"/>
+          <w:sz w:val="20"/>
+        </w:rPr>
+        <w:t>Commit: f588ec5.</w:t>
+      </w:r>
+    </w:p>
+    <w:p>
+      <w:r>
+        <w:rPr>
+          <w:rFonts w:ascii="Calibri" w:hAnsi="Calibri"/>
+          <w:b/>
+          <w:sz w:val="24"/>
+        </w:rPr>
+        <w:t>R-09 (MINOR): Duplicated validation clean-up</w:t>
+      </w:r>
+    </w:p>
+    <w:p>
+      <w:r>
+        <w:rPr>
+          <w:rFonts w:ascii="Calibri" w:hAnsi="Calibri"/>
+          <w:sz w:val="20"/>
+        </w:rPr>
+        <w:t>Problem: Validation logic was duplicated between DTO annotations and service layer null checks.</w:t>
+      </w:r>
+    </w:p>
+    <w:p>
+      <w:r>
+        <w:rPr>
+          <w:rFonts w:ascii="Calibri" w:hAnsi="Calibri"/>
+          <w:sz w:val="20"/>
+        </w:rPr>
+        <w:t>Fix: Kept format and structural rules (null, size, digits, range) in DTO annotations. Kept domain invariants and cross-field rules (STANDARD invariants, paid tier price &gt; 0, session minutes 60 or 90) in service layer. Removed dead null checks in service.</w:t>
+      </w:r>
+    </w:p>
+    <w:p>
+      <w:r>
+        <w:rPr>
+          <w:rFonts w:ascii="Calibri" w:hAnsi="Calibri"/>
+          <w:sz w:val="20"/>
+        </w:rPr>
+        <w:t>Files touched: backend/src/main/java/com/sportify/catalog/dto/SportPackageUpdateRequest.java, backend/src/main/java/com/sportify/catalog/dto/MembershipCardTierUpdateRequest.java, backend/src/main/java/com/sportify/catalog/service/impl/SportPackageServiceImpl.java, backend/src/main/java/com/sportify/catalog/service/impl/MembershipCardServiceImpl.java.</w:t>
+      </w:r>
+    </w:p>
+    <w:p>
+      <w:r>
+        <w:rPr>
+          <w:rFonts w:ascii="Calibri" w:hAnsi="Calibri"/>
+          <w:sz w:val="20"/>
+        </w:rPr>
+        <w:t>Commit: f588ec5, 8b7faf7.</w:t>
+      </w:r>
+    </w:p>
+    <w:p>
+      <w:r>
+        <w:rPr>
+          <w:rFonts w:ascii="Calibri" w:hAnsi="Calibri"/>
+          <w:b/>
+          <w:sz w:val="24"/>
+        </w:rPr>
+        <w:t>R-10 (MINOR): Optimistic locking documentation</w:t>
+      </w:r>
+    </w:p>
+    <w:p>
+      <w:r>
+        <w:rPr>
+          <w:rFonts w:ascii="Calibri" w:hAnsi="Calibri"/>
+          <w:sz w:val="20"/>
+        </w:rPr>
+        <w:t>Problem: Entities lack @Version field for optimistic concurrency control.</w:t>
+      </w:r>
+    </w:p>
+    <w:p>
+      <w:r>
+        <w:rPr>
+          <w:rFonts w:ascii="Calibri" w:hAnsi="Calibri"/>
+          <w:sz w:val="20"/>
+        </w:rPr>
+        <w:t>Decision: Limitation documented as an accepted risk under Assumptions and Open Issues: concurrent edits are last-write-wins, follow-up ticket recommended. Entities were intentionally not modified to avoid breaking changes.</w:t>
+      </w:r>
+    </w:p>
+    <w:p>
+      <w:r>
+        <w:rPr>
+          <w:rFonts w:ascii="Calibri" w:hAnsi="Calibri"/>
+          <w:sz w:val="20"/>
+        </w:rPr>
+        <w:t>Files touched: docs/ai-audit/BE-03_AI_Audit_Log.md, docs/ai-audit/BE-03_AI_Audit_Log.docx.</w:t>
+      </w:r>
+    </w:p>
+    <w:p>
+      <w:r>
+        <w:rPr>
+          <w:rFonts w:ascii="Calibri" w:hAnsi="Calibri"/>
+          <w:sz w:val="20"/>
+        </w:rPr>
+        <w:t>Commit: docs commit.</w:t>
+      </w:r>
+    </w:p>
+    <w:p>
+      <w:r>
+        <w:rPr>
+          <w:rFonts w:ascii="Calibri" w:hAnsi="Calibri"/>
+          <w:b/>
+          <w:sz w:val="24"/>
+        </w:rPr>
+        <w:t>R-11 (MINOR): PUT description full-replace semantics</w:t>
+      </w:r>
+    </w:p>
+    <w:p>
+      <w:r>
+        <w:rPr>
+          <w:rFonts w:ascii="Calibri" w:hAnsi="Calibri"/>
+          <w:sz w:val="20"/>
+        </w:rPr>
+        <w:t>Problem: Description update semantics were ambiguous.</w:t>
+      </w:r>
+    </w:p>
+    <w:p>
+      <w:r>
+        <w:rPr>
+          <w:rFonts w:ascii="Calibri" w:hAnsi="Calibri"/>
+          <w:sz w:val="20"/>
+        </w:rPr>
+        <w:t>Decision &amp; Fix: Implemented full-replace semantics across both package and tier updates: a null or blank string clears the description in the database to null. Documented in code comments, AI Audit Log, and test cases.</w:t>
+      </w:r>
+    </w:p>
+    <w:p>
+      <w:r>
+        <w:rPr>
+          <w:rFonts w:ascii="Calibri" w:hAnsi="Calibri"/>
+          <w:sz w:val="20"/>
+        </w:rPr>
+        <w:t>Files touched: backend/src/main/java/com/sportify/catalog/service/impl/SportPackageServiceImpl.java, backend/src/main/java/com/sportify/catalog/service/impl/MembershipCardServiceImpl.java, backend/src/test/java/com/sportify/catalog/service/SportPackageServiceImplTest.java, backend/src/test/java/com/sportify/catalog/service/MembershipCardServiceImplTest.java.</w:t>
+      </w:r>
+    </w:p>
+    <w:p>
+      <w:r>
+        <w:rPr>
+          <w:rFonts w:ascii="Calibri" w:hAnsi="Calibri"/>
+          <w:sz w:val="20"/>
+        </w:rPr>
+        <w:t>Commit: 8b7faf7.</w:t>
+      </w:r>
+    </w:p>
+    <w:p>
+      <w:r>
+        <w:rPr>
+          <w:rFonts w:ascii="Calibri" w:hAnsi="Calibri"/>
+          <w:b/>
+          <w:sz w:val="24"/>
+        </w:rPr>
+        <w:t>R-12 (NIT): Direct TrainingFormat binding and import order</w:t>
+      </w:r>
+    </w:p>
+    <w:p>
+      <w:r>
+        <w:rPr>
+          <w:rFonts w:ascii="Calibri" w:hAnsi="Calibri"/>
+          <w:sz w:val="20"/>
+        </w:rPr>
+        <w:t>Problem: Controller manually parsed format query parameter; messy import order in services.</w:t>
+      </w:r>
+    </w:p>
+    <w:p>
+      <w:r>
+        <w:rPr>
+          <w:rFonts w:ascii="Calibri" w:hAnsi="Calibri"/>
+          <w:sz w:val="20"/>
+        </w:rPr>
+        <w:t>Fix: Bound format query parameter directly as TrainingFormat in ManagerPackageController. MethodArgumentTypeMismatchException is handled by GlobalExceptionHandler returning HTTP 400. Tidied imports alphabetically in SportPackageServiceImpl and MembershipCardServiceImpl.</w:t>
+      </w:r>
+    </w:p>
+    <w:p>
+      <w:r>
+        <w:rPr>
+          <w:rFonts w:ascii="Calibri" w:hAnsi="Calibri"/>
+          <w:sz w:val="20"/>
+        </w:rPr>
+        <w:t>Files touched: backend/src/main/java/com/sportify/catalog/controller/ManagerPackageController.java, backend/src/main/java/com/sportify/catalog/service/impl/SportPackageServiceImpl.java, backend/src/main/java/com/sportify/catalog/service/impl/MembershipCardServiceImpl.java.</w:t>
+      </w:r>
+    </w:p>
+    <w:p>
+      <w:r>
+        <w:rPr>
+          <w:rFonts w:ascii="Calibri" w:hAnsi="Calibri"/>
+          <w:sz w:val="20"/>
+        </w:rPr>
+        <w:t>Commit: dce3300.</w:t>
+      </w:r>
+    </w:p>
+    <w:p>
+      <w:r>
+        <w:rPr>
+          <w:rFonts w:ascii="Calibri" w:hAnsi="Calibri"/>
+          <w:b/>
+          <w:sz w:val="24"/>
+        </w:rPr>
+        <w:t>R-13 (DOC): Documentation stale hash and open issues update</w:t>
+      </w:r>
+    </w:p>
+    <w:p>
+      <w:r>
+        <w:rPr>
+          <w:rFonts w:ascii="Calibri" w:hAnsi="Calibri"/>
+          <w:sz w:val="20"/>
+        </w:rPr>
+        <w:t>Problem: Commit 4 hash was recorded as 392f067 instead of real hash dbe924f; Open Issues stated None.</w:t>
+      </w:r>
+    </w:p>
+    <w:p>
+      <w:r>
+        <w:rPr>
+          <w:rFonts w:ascii="Calibri" w:hAnsi="Calibri"/>
+          <w:sz w:val="20"/>
+        </w:rPr>
+        <w:t>Fix: Corrected Commit 4 hash to dbe924f, updated Open Issues with R-10 accepted risk, and added Section 9 Review Fixes.</w:t>
+      </w:r>
+    </w:p>
+    <w:p>
+      <w:r>
+        <w:rPr>
+          <w:rFonts w:ascii="Calibri" w:hAnsi="Calibri"/>
+          <w:sz w:val="20"/>
+        </w:rPr>
+        <w:t>Files touched: docs/ai-audit/BE-03_AI_Audit_Log.docx, docs/ai-audit/BE-03_AI_Audit_Log.md, docs/tests/BE-03_test_cases.md.</w:t>
+      </w:r>
+    </w:p>
+    <w:p>
+      <w:r>
+        <w:rPr>
+          <w:rFonts w:ascii="Calibri" w:hAnsi="Calibri"/>
+          <w:sz w:val="20"/>
+        </w:rPr>
+        <w:t>Commit: docs commit.</w:t>
+      </w:r>
+    </w:p>
+    <w:p>
+      <w:r>
+        <w:rPr>
+          <w:rFonts w:ascii="Calibri" w:hAnsi="Calibri"/>
+          <w:b/>
+          <w:sz w:val="28"/>
+        </w:rPr>
+        <w:t>9. Review Fixes (Findings R-01 to R-13)</w:t>
+      </w:r>
+    </w:p>
+    <w:p>
+      <w:r>
+        <w:rPr>
+          <w:rFonts w:ascii="Calibri" w:hAnsi="Calibri"/>
+          <w:sz w:val="21"/>
+        </w:rPr>
+        <w:t>This section details the resolution of all thirteen review findings (R-01 through R-13) identified during the code review of branch feat/f1-manager-catalog.</w:t>
+      </w:r>
+    </w:p>
+    <w:tbl>
+      <w:tblPr>
+        <w:tblW w:type="auto" w:w="0"/>
+        <w:jc w:val="center"/>
+        <w:tblLook w:firstColumn="1" w:firstRow="1" w:lastColumn="0" w:lastRow="0" w:noHBand="0" w:noVBand="1" w:val="04A0"/>
+      </w:tblPr>
+      <w:tblGrid>
+        <w:gridCol w:w="1872"/>
+        <w:gridCol w:w="1872"/>
+        <w:gridCol w:w="1872"/>
+        <w:gridCol w:w="1872"/>
+        <w:gridCol w:w="1872"/>
+      </w:tblGrid>
+      <w:tr>
+        <w:tc>
+          <w:tcPr>
+            <w:tcW w:type="dxa" w:w="1872"/>
+          </w:tcPr>
+          <w:p>
+            <w:r>
+              <w:rPr>
+                <w:rFonts w:ascii="Calibri" w:hAnsi="Calibri"/>
+                <w:b/>
+                <w:sz w:val="20"/>
+              </w:rPr>
+              <w:t>ID</w:t>
+            </w:r>
+          </w:p>
+        </w:tc>
+        <w:tc>
+          <w:tcPr>
+            <w:tcW w:type="dxa" w:w="1872"/>
+          </w:tcPr>
+          <w:p>
+            <w:r>
+              <w:rPr>
+                <w:rFonts w:ascii="Calibri" w:hAnsi="Calibri"/>
+                <w:b/>
+                <w:sz w:val="20"/>
+              </w:rPr>
+              <w:t>Severity</w:t>
+            </w:r>
+          </w:p>
+        </w:tc>
+        <w:tc>
+          <w:tcPr>
+            <w:tcW w:type="dxa" w:w="1872"/>
+          </w:tcPr>
+          <w:p>
+            <w:r>
+              <w:rPr>
+                <w:rFonts w:ascii="Calibri" w:hAnsi="Calibri"/>
+                <w:b/>
+                <w:sz w:val="20"/>
+              </w:rPr>
+              <w:t>Title</w:t>
+            </w:r>
+          </w:p>
+        </w:tc>
+        <w:tc>
+          <w:tcPr>
+            <w:tcW w:type="dxa" w:w="1872"/>
+          </w:tcPr>
+          <w:p>
+            <w:r>
+              <w:rPr>
+                <w:rFonts w:ascii="Calibri" w:hAnsi="Calibri"/>
+                <w:b/>
+                <w:sz w:val="20"/>
+              </w:rPr>
+              <w:t>Status</w:t>
+            </w:r>
+          </w:p>
+        </w:tc>
+        <w:tc>
+          <w:tcPr>
+            <w:tcW w:type="dxa" w:w="1872"/>
+          </w:tcPr>
+          <w:p>
+            <w:r>
+              <w:rPr>
+                <w:rFonts w:ascii="Calibri" w:hAnsi="Calibri"/>
+                <w:b/>
+                <w:sz w:val="20"/>
+              </w:rPr>
+              <w:t>Commit</w:t>
+            </w:r>
+          </w:p>
+        </w:tc>
+      </w:tr>
+      <w:tr>
+        <w:tc>
+          <w:tcPr>
+            <w:tcW w:type="dxa" w:w="1872"/>
+          </w:tcPr>
+          <w:p>
+            <w:r>
+              <w:rPr>
+                <w:rFonts w:ascii="Calibri" w:hAnsi="Calibri"/>
+                <w:sz w:val="19"/>
+              </w:rPr>
+              <w:t>R-01</w:t>
+            </w:r>
+          </w:p>
+        </w:tc>
+        <w:tc>
+          <w:tcPr>
+            <w:tcW w:type="dxa" w:w="1872"/>
+          </w:tcPr>
+          <w:p>
+            <w:r>
+              <w:rPr>
+                <w:rFonts w:ascii="Calibri" w:hAnsi="Calibri"/>
+                <w:sz w:val="19"/>
+              </w:rPr>
+              <w:t>BLOCKER</w:t>
+            </w:r>
+          </w:p>
+        </w:tc>
+        <w:tc>
+          <w:tcPr>
+            <w:tcW w:type="dxa" w:w="1872"/>
+          </w:tcPr>
+          <w:p>
+            <w:r>
+              <w:rPr>
+                <w:rFonts w:ascii="Calibri" w:hAnsi="Calibri"/>
+                <w:sz w:val="19"/>
+              </w:rPr>
+              <w:t>Duration months hole and STANDARD invariant</w:t>
+            </w:r>
+          </w:p>
+        </w:tc>
+        <w:tc>
+          <w:tcPr>
+            <w:tcW w:type="dxa" w:w="1872"/>
+          </w:tcPr>
+          <w:p>
+            <w:r>
+              <w:rPr>
+                <w:rFonts w:ascii="Calibri" w:hAnsi="Calibri"/>
+                <w:sz w:val="19"/>
+              </w:rPr>
+              <w:t>Fixed</w:t>
+            </w:r>
+          </w:p>
+        </w:tc>
+        <w:tc>
+          <w:tcPr>
+            <w:tcW w:type="dxa" w:w="1872"/>
+          </w:tcPr>
+          <w:p>
+            <w:r>
+              <w:rPr>
+                <w:rFonts w:ascii="Calibri" w:hAnsi="Calibri"/>
+                <w:sz w:val="19"/>
+              </w:rPr>
+              <w:t>f588ec5</w:t>
+            </w:r>
+          </w:p>
+        </w:tc>
+      </w:tr>
+      <w:tr>
+        <w:tc>
+          <w:tcPr>
+            <w:tcW w:type="dxa" w:w="1872"/>
+          </w:tcPr>
+          <w:p>
+            <w:r>
+              <w:rPr>
+                <w:rFonts w:ascii="Calibri" w:hAnsi="Calibri"/>
+                <w:sz w:val="19"/>
+              </w:rPr>
+              <w:t>R-02</w:t>
+            </w:r>
+          </w:p>
+        </w:tc>
+        <w:tc>
+          <w:tcPr>
+            <w:tcW w:type="dxa" w:w="1872"/>
+          </w:tcPr>
+          <w:p>
+            <w:r>
+              <w:rPr>
+                <w:rFonts w:ascii="Calibri" w:hAnsi="Calibri"/>
+                <w:sz w:val="19"/>
+              </w:rPr>
+              <w:t>MAJOR</w:t>
+            </w:r>
+          </w:p>
+        </w:tc>
+        <w:tc>
+          <w:tcPr>
+            <w:tcW w:type="dxa" w:w="1872"/>
+          </w:tcPr>
+          <w:p>
+            <w:r>
+              <w:rPr>
+                <w:rFonts w:ascii="Calibri" w:hAnsi="Calibri"/>
+                <w:sz w:val="19"/>
+              </w:rPr>
+              <w:t>Cards retain old price and snapshot-safe upgrades</w:t>
+            </w:r>
+          </w:p>
+        </w:tc>
+        <w:tc>
+          <w:tcPr>
+            <w:tcW w:type="dxa" w:w="1872"/>
+          </w:tcPr>
+          <w:p>
+            <w:r>
+              <w:rPr>
+                <w:rFonts w:ascii="Calibri" w:hAnsi="Calibri"/>
+                <w:sz w:val="19"/>
+              </w:rPr>
+              <w:t>Fixed</w:t>
+            </w:r>
+          </w:p>
+        </w:tc>
+        <w:tc>
+          <w:tcPr>
+            <w:tcW w:type="dxa" w:w="1872"/>
+          </w:tcPr>
+          <w:p>
+            <w:r>
+              <w:rPr>
+                <w:rFonts w:ascii="Calibri" w:hAnsi="Calibri"/>
+                <w:sz w:val="19"/>
+              </w:rPr>
+              <w:t>ce20721</w:t>
+            </w:r>
+          </w:p>
+        </w:tc>
+      </w:tr>
+      <w:tr>
+        <w:tc>
+          <w:tcPr>
+            <w:tcW w:type="dxa" w:w="1872"/>
+          </w:tcPr>
+          <w:p>
+            <w:r>
+              <w:rPr>
+                <w:rFonts w:ascii="Calibri" w:hAnsi="Calibri"/>
+                <w:sz w:val="19"/>
+              </w:rPr>
+              <w:t>R-03</w:t>
+            </w:r>
+          </w:p>
+        </w:tc>
+        <w:tc>
+          <w:tcPr>
+            <w:tcW w:type="dxa" w:w="1872"/>
+          </w:tcPr>
+          <w:p>
+            <w:r>
+              <w:rPr>
+                <w:rFonts w:ascii="Calibri" w:hAnsi="Calibri"/>
+                <w:sz w:val="19"/>
+              </w:rPr>
+              <w:t>MAJOR</w:t>
+            </w:r>
+          </w:p>
+        </w:tc>
+        <w:tc>
+          <w:tcPr>
+            <w:tcW w:type="dxa" w:w="1872"/>
+          </w:tcPr>
+          <w:p>
+            <w:r>
+              <w:rPr>
+                <w:rFonts w:ascii="Calibri" w:hAnsi="Calibri"/>
+                <w:sz w:val="19"/>
+              </w:rPr>
+              <w:t>Explicit discount behavior for tiers and cards</w:t>
+            </w:r>
+          </w:p>
+        </w:tc>
+        <w:tc>
+          <w:tcPr>
+            <w:tcW w:type="dxa" w:w="1872"/>
+          </w:tcPr>
+          <w:p>
+            <w:r>
+              <w:rPr>
+                <w:rFonts w:ascii="Calibri" w:hAnsi="Calibri"/>
+                <w:sz w:val="19"/>
+              </w:rPr>
+              <w:t>Fixed</w:t>
+            </w:r>
+          </w:p>
+        </w:tc>
+        <w:tc>
+          <w:tcPr>
+            <w:tcW w:type="dxa" w:w="1872"/>
+          </w:tcPr>
+          <w:p>
+            <w:r>
+              <w:rPr>
+                <w:rFonts w:ascii="Calibri" w:hAnsi="Calibri"/>
+                <w:sz w:val="19"/>
+              </w:rPr>
+              <w:t>ce20721</w:t>
+            </w:r>
+          </w:p>
+        </w:tc>
+      </w:tr>
+      <w:tr>
+        <w:tc>
+          <w:tcPr>
+            <w:tcW w:type="dxa" w:w="1872"/>
+          </w:tcPr>
+          <w:p>
+            <w:r>
+              <w:rPr>
+                <w:rFonts w:ascii="Calibri" w:hAnsi="Calibri"/>
+                <w:sz w:val="19"/>
+              </w:rPr>
+              <w:t>R-04</w:t>
+            </w:r>
+          </w:p>
+        </w:tc>
+        <w:tc>
+          <w:tcPr>
+            <w:tcW w:type="dxa" w:w="1872"/>
+          </w:tcPr>
+          <w:p>
+            <w:r>
+              <w:rPr>
+                <w:rFonts w:ascii="Calibri" w:hAnsi="Calibri"/>
+                <w:sz w:val="19"/>
+              </w:rPr>
+              <w:t>MAJOR</w:t>
+            </w:r>
+          </w:p>
+        </w:tc>
+        <w:tc>
+          <w:tcPr>
+            <w:tcW w:type="dxa" w:w="1872"/>
+          </w:tcPr>
+          <w:p>
+            <w:r>
+              <w:rPr>
+                <w:rFonts w:ascii="Calibri" w:hAnsi="Calibri"/>
+                <w:sz w:val="19"/>
+              </w:rPr>
+              <w:t>Length and precision validation annotations</w:t>
+            </w:r>
+          </w:p>
+        </w:tc>
+        <w:tc>
+          <w:tcPr>
+            <w:tcW w:type="dxa" w:w="1872"/>
+          </w:tcPr>
+          <w:p>
+            <w:r>
+              <w:rPr>
+                <w:rFonts w:ascii="Calibri" w:hAnsi="Calibri"/>
+                <w:sz w:val="19"/>
+              </w:rPr>
+              <w:t>Fixed</w:t>
+            </w:r>
+          </w:p>
+        </w:tc>
+        <w:tc>
+          <w:tcPr>
+            <w:tcW w:type="dxa" w:w="1872"/>
+          </w:tcPr>
+          <w:p>
+            <w:r>
+              <w:rPr>
+                <w:rFonts w:ascii="Calibri" w:hAnsi="Calibri"/>
+                <w:sz w:val="19"/>
+              </w:rPr>
+              <w:t>8b7faf7</w:t>
+            </w:r>
+          </w:p>
+        </w:tc>
+      </w:tr>
+      <w:tr>
+        <w:tc>
+          <w:tcPr>
+            <w:tcW w:type="dxa" w:w="1872"/>
+          </w:tcPr>
+          <w:p>
+            <w:r>
+              <w:rPr>
+                <w:rFonts w:ascii="Calibri" w:hAnsi="Calibri"/>
+                <w:sz w:val="19"/>
+              </w:rPr>
+              <w:t>R-05</w:t>
+            </w:r>
+          </w:p>
+        </w:tc>
+        <w:tc>
+          <w:tcPr>
+            <w:tcW w:type="dxa" w:w="1872"/>
+          </w:tcPr>
+          <w:p>
+            <w:r>
+              <w:rPr>
+                <w:rFonts w:ascii="Calibri" w:hAnsi="Calibri"/>
+                <w:sz w:val="19"/>
+              </w:rPr>
+              <w:t>MAJOR</w:t>
+            </w:r>
+          </w:p>
+        </w:tc>
+        <w:tc>
+          <w:tcPr>
+            <w:tcW w:type="dxa" w:w="1872"/>
+          </w:tcPr>
+          <w:p>
+            <w:r>
+              <w:rPr>
+                <w:rFonts w:ascii="Calibri" w:hAnsi="Calibri"/>
+                <w:sz w:val="19"/>
+              </w:rPr>
+              <w:t>Real test evidence and integration test suite</w:t>
+            </w:r>
+          </w:p>
+        </w:tc>
+        <w:tc>
+          <w:tcPr>
+            <w:tcW w:type="dxa" w:w="1872"/>
+          </w:tcPr>
+          <w:p>
+            <w:r>
+              <w:rPr>
+                <w:rFonts w:ascii="Calibri" w:hAnsi="Calibri"/>
+                <w:sz w:val="19"/>
+              </w:rPr>
+              <w:t>Fixed</w:t>
+            </w:r>
+          </w:p>
+        </w:tc>
+        <w:tc>
+          <w:tcPr>
+            <w:tcW w:type="dxa" w:w="1872"/>
+          </w:tcPr>
+          <w:p>
+            <w:r>
+              <w:rPr>
+                <w:rFonts w:ascii="Calibri" w:hAnsi="Calibri"/>
+                <w:sz w:val="19"/>
+              </w:rPr>
+              <w:t>0c38b37</w:t>
+            </w:r>
+          </w:p>
+        </w:tc>
+      </w:tr>
+      <w:tr>
+        <w:tc>
+          <w:tcPr>
+            <w:tcW w:type="dxa" w:w="1872"/>
+          </w:tcPr>
+          <w:p>
+            <w:r>
+              <w:rPr>
+                <w:rFonts w:ascii="Calibri" w:hAnsi="Calibri"/>
+                <w:sz w:val="19"/>
+              </w:rPr>
+              <w:t>R-06</w:t>
+            </w:r>
+          </w:p>
+        </w:tc>
+        <w:tc>
+          <w:tcPr>
+            <w:tcW w:type="dxa" w:w="1872"/>
+          </w:tcPr>
+          <w:p>
+            <w:r>
+              <w:rPr>
+                <w:rFonts w:ascii="Calibri" w:hAnsi="Calibri"/>
+                <w:sz w:val="19"/>
+              </w:rPr>
+              <w:t>MEDIUM</w:t>
+            </w:r>
+          </w:p>
+        </w:tc>
+        <w:tc>
+          <w:tcPr>
+            <w:tcW w:type="dxa" w:w="1872"/>
+          </w:tcPr>
+          <w:p>
+            <w:r>
+              <w:rPr>
+                <w:rFonts w:ascii="Calibri" w:hAnsi="Calibri"/>
+                <w:sz w:val="19"/>
+              </w:rPr>
+              <w:t>Scope creep: duplicate routes and alias removal</w:t>
+            </w:r>
+          </w:p>
+        </w:tc>
+        <w:tc>
+          <w:tcPr>
+            <w:tcW w:type="dxa" w:w="1872"/>
+          </w:tcPr>
+          <w:p>
+            <w:r>
+              <w:rPr>
+                <w:rFonts w:ascii="Calibri" w:hAnsi="Calibri"/>
+                <w:sz w:val="19"/>
+              </w:rPr>
+              <w:t>Fixed</w:t>
+            </w:r>
+          </w:p>
+        </w:tc>
+        <w:tc>
+          <w:tcPr>
+            <w:tcW w:type="dxa" w:w="1872"/>
+          </w:tcPr>
+          <w:p>
+            <w:r>
+              <w:rPr>
+                <w:rFonts w:ascii="Calibri" w:hAnsi="Calibri"/>
+                <w:sz w:val="19"/>
+              </w:rPr>
+              <w:t>8b7faf7, dce3300</w:t>
+            </w:r>
+          </w:p>
+        </w:tc>
+      </w:tr>
+      <w:tr>
+        <w:tc>
+          <w:tcPr>
+            <w:tcW w:type="dxa" w:w="1872"/>
+          </w:tcPr>
+          <w:p>
+            <w:r>
+              <w:rPr>
+                <w:rFonts w:ascii="Calibri" w:hAnsi="Calibri"/>
+                <w:sz w:val="19"/>
+              </w:rPr>
+              <w:t>R-07</w:t>
+            </w:r>
+          </w:p>
+        </w:tc>
+        <w:tc>
+          <w:tcPr>
+            <w:tcW w:type="dxa" w:w="1872"/>
+          </w:tcPr>
+          <w:p>
+            <w:r>
+              <w:rPr>
+                <w:rFonts w:ascii="Calibri" w:hAnsi="Calibri"/>
+                <w:sz w:val="19"/>
+              </w:rPr>
+              <w:t>MEDIUM</w:t>
+            </w:r>
+          </w:p>
+        </w:tc>
+        <w:tc>
+          <w:tcPr>
+            <w:tcW w:type="dxa" w:w="1872"/>
+          </w:tcPr>
+          <w:p>
+            <w:r>
+              <w:rPr>
+                <w:rFonts w:ascii="Calibri" w:hAnsi="Calibri"/>
+                <w:sz w:val="19"/>
+              </w:rPr>
+              <w:t>Null actor ternary check removal in PUT handlers</w:t>
+            </w:r>
+          </w:p>
+        </w:tc>
+        <w:tc>
+          <w:tcPr>
+            <w:tcW w:type="dxa" w:w="1872"/>
+          </w:tcPr>
+          <w:p>
+            <w:r>
+              <w:rPr>
+                <w:rFonts w:ascii="Calibri" w:hAnsi="Calibri"/>
+                <w:sz w:val="19"/>
+              </w:rPr>
+              <w:t>Fixed</w:t>
+            </w:r>
+          </w:p>
+        </w:tc>
+        <w:tc>
+          <w:tcPr>
+            <w:tcW w:type="dxa" w:w="1872"/>
+          </w:tcPr>
+          <w:p>
+            <w:r>
+              <w:rPr>
+                <w:rFonts w:ascii="Calibri" w:hAnsi="Calibri"/>
+                <w:sz w:val="19"/>
+              </w:rPr>
+              <w:t>dce3300</w:t>
+            </w:r>
+          </w:p>
+        </w:tc>
+      </w:tr>
+      <w:tr>
+        <w:tc>
+          <w:tcPr>
+            <w:tcW w:type="dxa" w:w="1872"/>
+          </w:tcPr>
+          <w:p>
+            <w:r>
+              <w:rPr>
+                <w:rFonts w:ascii="Calibri" w:hAnsi="Calibri"/>
+                <w:sz w:val="19"/>
+              </w:rPr>
+              <w:t>R-08</w:t>
+            </w:r>
+          </w:p>
+        </w:tc>
+        <w:tc>
+          <w:tcPr>
+            <w:tcW w:type="dxa" w:w="1872"/>
+          </w:tcPr>
+          <w:p>
+            <w:r>
+              <w:rPr>
+                <w:rFonts w:ascii="Calibri" w:hAnsi="Calibri"/>
+                <w:sz w:val="19"/>
+              </w:rPr>
+              <w:t>MEDIUM</w:t>
+            </w:r>
+          </w:p>
+        </w:tc>
+        <w:tc>
+          <w:tcPr>
+            <w:tcW w:type="dxa" w:w="1872"/>
+          </w:tcPr>
+          <w:p>
+            <w:r>
+              <w:rPr>
+                <w:rFonts w:ascii="Calibri" w:hAnsi="Calibri"/>
+                <w:sz w:val="19"/>
+              </w:rPr>
+              <w:t>Single definition of STANDARD tier code and helper</w:t>
+            </w:r>
+          </w:p>
+        </w:tc>
+        <w:tc>
+          <w:tcPr>
+            <w:tcW w:type="dxa" w:w="1872"/>
+          </w:tcPr>
+          <w:p>
+            <w:r>
+              <w:rPr>
+                <w:rFonts w:ascii="Calibri" w:hAnsi="Calibri"/>
+                <w:sz w:val="19"/>
+              </w:rPr>
+              <w:t>Fixed</w:t>
+            </w:r>
+          </w:p>
+        </w:tc>
+        <w:tc>
+          <w:tcPr>
+            <w:tcW w:type="dxa" w:w="1872"/>
+          </w:tcPr>
+          <w:p>
+            <w:r>
+              <w:rPr>
+                <w:rFonts w:ascii="Calibri" w:hAnsi="Calibri"/>
+                <w:sz w:val="19"/>
+              </w:rPr>
+              <w:t>f588ec5</w:t>
+            </w:r>
+          </w:p>
+        </w:tc>
+      </w:tr>
+      <w:tr>
+        <w:tc>
+          <w:tcPr>
+            <w:tcW w:type="dxa" w:w="1872"/>
+          </w:tcPr>
+          <w:p>
+            <w:r>
+              <w:rPr>
+                <w:rFonts w:ascii="Calibri" w:hAnsi="Calibri"/>
+                <w:sz w:val="19"/>
+              </w:rPr>
+              <w:t>R-09</w:t>
+            </w:r>
+          </w:p>
+        </w:tc>
+        <w:tc>
+          <w:tcPr>
+            <w:tcW w:type="dxa" w:w="1872"/>
+          </w:tcPr>
+          <w:p>
+            <w:r>
+              <w:rPr>
+                <w:rFonts w:ascii="Calibri" w:hAnsi="Calibri"/>
+                <w:sz w:val="19"/>
+              </w:rPr>
+              <w:t>MINOR</w:t>
+            </w:r>
+          </w:p>
+        </w:tc>
+        <w:tc>
+          <w:tcPr>
+            <w:tcW w:type="dxa" w:w="1872"/>
+          </w:tcPr>
+          <w:p>
+            <w:r>
+              <w:rPr>
+                <w:rFonts w:ascii="Calibri" w:hAnsi="Calibri"/>
+                <w:sz w:val="19"/>
+              </w:rPr>
+              <w:t>Duplicated validation clean-up between DTO and service</w:t>
+            </w:r>
+          </w:p>
+        </w:tc>
+        <w:tc>
+          <w:tcPr>
+            <w:tcW w:type="dxa" w:w="1872"/>
+          </w:tcPr>
+          <w:p>
+            <w:r>
+              <w:rPr>
+                <w:rFonts w:ascii="Calibri" w:hAnsi="Calibri"/>
+                <w:sz w:val="19"/>
+              </w:rPr>
+              <w:t>Fixed</w:t>
+            </w:r>
+          </w:p>
+        </w:tc>
+        <w:tc>
+          <w:tcPr>
+            <w:tcW w:type="dxa" w:w="1872"/>
+          </w:tcPr>
+          <w:p>
+            <w:r>
+              <w:rPr>
+                <w:rFonts w:ascii="Calibri" w:hAnsi="Calibri"/>
+                <w:sz w:val="19"/>
+              </w:rPr>
+              <w:t>f588ec5, 8b7faf7</w:t>
+            </w:r>
+          </w:p>
+        </w:tc>
+      </w:tr>
+      <w:tr>
+        <w:tc>
+          <w:tcPr>
+            <w:tcW w:type="dxa" w:w="1872"/>
+          </w:tcPr>
+          <w:p>
+            <w:r>
+              <w:rPr>
+                <w:rFonts w:ascii="Calibri" w:hAnsi="Calibri"/>
+                <w:sz w:val="19"/>
+              </w:rPr>
+              <w:t>R-10</w:t>
+            </w:r>
+          </w:p>
+        </w:tc>
+        <w:tc>
+          <w:tcPr>
+            <w:tcW w:type="dxa" w:w="1872"/>
+          </w:tcPr>
+          <w:p>
+            <w:r>
+              <w:rPr>
+                <w:rFonts w:ascii="Calibri" w:hAnsi="Calibri"/>
+                <w:sz w:val="19"/>
+              </w:rPr>
+              <w:t>MINOR</w:t>
+            </w:r>
+          </w:p>
+        </w:tc>
+        <w:tc>
+          <w:tcPr>
+            <w:tcW w:type="dxa" w:w="1872"/>
+          </w:tcPr>
+          <w:p>
+            <w:r>
+              <w:rPr>
+                <w:rFonts w:ascii="Calibri" w:hAnsi="Calibri"/>
+                <w:sz w:val="19"/>
+              </w:rPr>
+              <w:t>Optimistic locking documentation as accepted risk</w:t>
+            </w:r>
+          </w:p>
+        </w:tc>
+        <w:tc>
+          <w:tcPr>
+            <w:tcW w:type="dxa" w:w="1872"/>
+          </w:tcPr>
+          <w:p>
+            <w:r>
+              <w:rPr>
+                <w:rFonts w:ascii="Calibri" w:hAnsi="Calibri"/>
+                <w:sz w:val="19"/>
+              </w:rPr>
+              <w:t>Accepted Risk</w:t>
+            </w:r>
+          </w:p>
+        </w:tc>
+        <w:tc>
+          <w:tcPr>
+            <w:tcW w:type="dxa" w:w="1872"/>
+          </w:tcPr>
+          <w:p>
+            <w:r>
+              <w:rPr>
+                <w:rFonts w:ascii="Calibri" w:hAnsi="Calibri"/>
+                <w:sz w:val="19"/>
+              </w:rPr>
+              <w:t>6cc092b</w:t>
+            </w:r>
+          </w:p>
+        </w:tc>
+      </w:tr>
+      <w:tr>
+        <w:tc>
+          <w:tcPr>
+            <w:tcW w:type="dxa" w:w="1872"/>
+          </w:tcPr>
+          <w:p>
+            <w:r>
+              <w:rPr>
+                <w:rFonts w:ascii="Calibri" w:hAnsi="Calibri"/>
+                <w:sz w:val="19"/>
+              </w:rPr>
+              <w:t>R-11</w:t>
+            </w:r>
+          </w:p>
+        </w:tc>
+        <w:tc>
+          <w:tcPr>
+            <w:tcW w:type="dxa" w:w="1872"/>
+          </w:tcPr>
+          <w:p>
+            <w:r>
+              <w:rPr>
+                <w:rFonts w:ascii="Calibri" w:hAnsi="Calibri"/>
+                <w:sz w:val="19"/>
+              </w:rPr>
+              <w:t>MINOR</w:t>
+            </w:r>
+          </w:p>
+        </w:tc>
+        <w:tc>
+          <w:tcPr>
+            <w:tcW w:type="dxa" w:w="1872"/>
+          </w:tcPr>
+          <w:p>
+            <w:r>
+              <w:rPr>
+                <w:rFonts w:ascii="Calibri" w:hAnsi="Calibri"/>
+                <w:sz w:val="19"/>
+              </w:rPr>
+              <w:t>PUT description full-replace semantics</w:t>
+            </w:r>
+          </w:p>
+        </w:tc>
+        <w:tc>
+          <w:tcPr>
+            <w:tcW w:type="dxa" w:w="1872"/>
+          </w:tcPr>
+          <w:p>
+            <w:r>
+              <w:rPr>
+                <w:rFonts w:ascii="Calibri" w:hAnsi="Calibri"/>
+                <w:sz w:val="19"/>
+              </w:rPr>
+              <w:t>Fixed</w:t>
+            </w:r>
+          </w:p>
+        </w:tc>
+        <w:tc>
+          <w:tcPr>
+            <w:tcW w:type="dxa" w:w="1872"/>
+          </w:tcPr>
+          <w:p>
+            <w:r>
+              <w:rPr>
+                <w:rFonts w:ascii="Calibri" w:hAnsi="Calibri"/>
+                <w:sz w:val="19"/>
+              </w:rPr>
+              <w:t>8b7faf7</w:t>
+            </w:r>
+          </w:p>
+        </w:tc>
+      </w:tr>
+      <w:tr>
+        <w:tc>
+          <w:tcPr>
+            <w:tcW w:type="dxa" w:w="1872"/>
+          </w:tcPr>
+          <w:p>
+            <w:r>
+              <w:rPr>
+                <w:rFonts w:ascii="Calibri" w:hAnsi="Calibri"/>
+                <w:sz w:val="19"/>
+              </w:rPr>
+              <w:t>R-12</w:t>
+            </w:r>
+          </w:p>
+        </w:tc>
+        <w:tc>
+          <w:tcPr>
+            <w:tcW w:type="dxa" w:w="1872"/>
+          </w:tcPr>
+          <w:p>
+            <w:r>
+              <w:rPr>
+                <w:rFonts w:ascii="Calibri" w:hAnsi="Calibri"/>
+                <w:sz w:val="19"/>
+              </w:rPr>
+              <w:t>NIT</w:t>
+            </w:r>
+          </w:p>
+        </w:tc>
+        <w:tc>
+          <w:tcPr>
+            <w:tcW w:type="dxa" w:w="1872"/>
+          </w:tcPr>
+          <w:p>
+            <w:r>
+              <w:rPr>
+                <w:rFonts w:ascii="Calibri" w:hAnsi="Calibri"/>
+                <w:sz w:val="19"/>
+              </w:rPr>
+              <w:t>Direct TrainingFormat binding and import order tidy</w:t>
+            </w:r>
+          </w:p>
+        </w:tc>
+        <w:tc>
+          <w:tcPr>
+            <w:tcW w:type="dxa" w:w="1872"/>
+          </w:tcPr>
+          <w:p>
+            <w:r>
+              <w:rPr>
+                <w:rFonts w:ascii="Calibri" w:hAnsi="Calibri"/>
+                <w:sz w:val="19"/>
+              </w:rPr>
+              <w:t>Fixed</w:t>
+            </w:r>
+          </w:p>
+        </w:tc>
+        <w:tc>
+          <w:tcPr>
+            <w:tcW w:type="dxa" w:w="1872"/>
+          </w:tcPr>
+          <w:p>
+            <w:r>
+              <w:rPr>
+                <w:rFonts w:ascii="Calibri" w:hAnsi="Calibri"/>
+                <w:sz w:val="19"/>
+              </w:rPr>
+              <w:t>dce3300</w:t>
+            </w:r>
+          </w:p>
+        </w:tc>
+      </w:tr>
+      <w:tr>
+        <w:tc>
+          <w:tcPr>
+            <w:tcW w:type="dxa" w:w="1872"/>
+          </w:tcPr>
+          <w:p>
+            <w:r>
+              <w:rPr>
+                <w:rFonts w:ascii="Calibri" w:hAnsi="Calibri"/>
+                <w:sz w:val="19"/>
+              </w:rPr>
+              <w:t>R-13</w:t>
+            </w:r>
+          </w:p>
+        </w:tc>
+        <w:tc>
+          <w:tcPr>
+            <w:tcW w:type="dxa" w:w="1872"/>
+          </w:tcPr>
+          <w:p>
+            <w:r>
+              <w:rPr>
+                <w:rFonts w:ascii="Calibri" w:hAnsi="Calibri"/>
+                <w:sz w:val="19"/>
+              </w:rPr>
+              <w:t>DOC</w:t>
+            </w:r>
+          </w:p>
+        </w:tc>
+        <w:tc>
+          <w:tcPr>
+            <w:tcW w:type="dxa" w:w="1872"/>
+          </w:tcPr>
+          <w:p>
+            <w:r>
+              <w:rPr>
+                <w:rFonts w:ascii="Calibri" w:hAnsi="Calibri"/>
+                <w:sz w:val="19"/>
+              </w:rPr>
+              <w:t>Documentation stale hash and open issues update</w:t>
+            </w:r>
+          </w:p>
+        </w:tc>
+        <w:tc>
+          <w:tcPr>
+            <w:tcW w:type="dxa" w:w="1872"/>
+          </w:tcPr>
+          <w:p>
+            <w:r>
+              <w:rPr>
+                <w:rFonts w:ascii="Calibri" w:hAnsi="Calibri"/>
+                <w:sz w:val="19"/>
+              </w:rPr>
+              <w:t>Fixed</w:t>
+            </w:r>
+          </w:p>
+        </w:tc>
+        <w:tc>
+          <w:tcPr>
+            <w:tcW w:type="dxa" w:w="1872"/>
+          </w:tcPr>
+          <w:p>
+            <w:r>
+              <w:rPr>
+                <w:rFonts w:ascii="Calibri" w:hAnsi="Calibri"/>
+                <w:sz w:val="19"/>
+              </w:rPr>
+              <w:t>6cc092b</w:t>
+            </w:r>
+          </w:p>
+        </w:tc>
+      </w:tr>
+    </w:tbl>
+    <w:p>
+      <w:r>
+        <w:rPr>
+          <w:rFonts w:ascii="Calibri" w:hAnsi="Calibri"/>
+          <w:b/>
+          <w:sz w:val="24"/>
+        </w:rPr>
+        <w:t>R-01 (BLOCKER): Duration months hole</w:t>
+      </w:r>
+    </w:p>
+    <w:p>
+      <w:r>
+        <w:rPr>
+          <w:rFonts w:ascii="Calibri" w:hAnsi="Calibri"/>
+          <w:sz w:val="20"/>
+        </w:rPr>
+        <w:t>Problem: purchaseCard treated any tier with durationMonths &lt;= 0 as free and permanent, creating an ACTIVE card without requiring payment. updateTier also accepted durationMonths 0 for paid tiers and allowed changing STANDARD durationMonths.</w:t>
+      </w:r>
+    </w:p>
+    <w:p>
+      <w:r>
+        <w:rPr>
+          <w:rFonts w:ascii="Calibri" w:hAnsi="Calibri"/>
+          <w:sz w:val="20"/>
+        </w:rPr>
+        <w:t>Fix: Enforced durationMonths &gt;= 1 on paid tiers in DTO (@Min(1)) and service (HTTP 400). Enforced STANDARD durationMonths == 0 in service (HTTP 400). Unified STANDARD checks via isStandard(tier) helper. In purchaseCard, only tiers satisfying isStandard(tier) receive free permanent ACTIVE cards.</w:t>
+      </w:r>
+    </w:p>
+    <w:p>
+      <w:r>
+        <w:rPr>
+          <w:rFonts w:ascii="Calibri" w:hAnsi="Calibri"/>
+          <w:sz w:val="20"/>
+        </w:rPr>
+        <w:t>Files touched: backend/src/main/java/com/sportify/catalog/dto/MembershipCardTierUpdateRequest.java, backend/src/main/java/com/sportify/catalog/service/impl/MembershipCardServiceImpl.java, backend/src/test/java/com/sportify/catalog/service/MembershipCardServiceImplTest.java.</w:t>
+      </w:r>
+    </w:p>
+    <w:p>
+      <w:r>
+        <w:rPr>
+          <w:rFonts w:ascii="Calibri" w:hAnsi="Calibri"/>
+          <w:sz w:val="20"/>
+        </w:rPr>
+        <w:t>Commit: f588ec5.</w:t>
+      </w:r>
+    </w:p>
+    <w:p>
+      <w:r>
+        <w:rPr>
+          <w:rFonts w:ascii="Calibri" w:hAnsi="Calibri"/>
+          <w:b/>
+          <w:sz w:val="24"/>
+        </w:rPr>
+        <w:t>R-02 (MAJOR): Cards must keep their old price</w:t>
+      </w:r>
+    </w:p>
+    <w:p>
+      <w:r>
+        <w:rPr>
+          <w:rFonts w:ascii="Calibri" w:hAnsi="Calibri"/>
+          <w:sz w:val="20"/>
+        </w:rPr>
+        <w:t>Problem: (a) activateCard compared card.pricePaid with live tier price to detect upgrades; after manager raised tier price, pending cards created at old prices threw 'The member card has changed since this request'. (b) planCard computed upgrade difference from live tier price instead of actual price paid.</w:t>
+      </w:r>
+    </w:p>
+    <w:p>
+      <w:r>
+        <w:rPr>
+          <w:rFonts w:ascii="Calibri" w:hAnsi="Calibri"/>
+          <w:sz w:val="20"/>
+        </w:rPr>
+        <w:t>Decision &amp; Fix: Upgrade base decision: Upgrade difference is calculated from current.getPricePaid(), and for cards that were themselves upgrades, from calculateTermBasePrice(current) which accumulates pricePaid recursively across the replacement chain. This ensures fair pricing regardless of intermediate upgrades. Added explicit upgrade marker upgrade_request BIT NOT NULL DEFAULT 0 and replaces_card_id BIGINT NULL FK on member_card via Flyway migration V22__add_upgrade_tracking_to_member_card.sql with safe backfill. Updated MemberCard entity, purchase flow, and activation flow.</w:t>
+      </w:r>
+    </w:p>
+    <w:p>
+      <w:r>
+        <w:rPr>
+          <w:rFonts w:ascii="Calibri" w:hAnsi="Calibri"/>
+          <w:sz w:val="20"/>
+        </w:rPr>
+        <w:t>Files touched: backend/src/main/resources/db/migration/catalog/V22__add_upgrade_tracking_to_member_card.sql, backend/src/main/java/com/sportify/catalog/entity/MemberCard.java, backend/src/main/java/com/sportify/catalog/service/impl/MembershipCardServiceImpl.java, backend/src/test/java/com/sportify/catalog/service/MembershipCardServiceImplTest.java, docs/database/schema/02-catalog-and-membership.md, docs/database/02-catalog-and-membership.md.</w:t>
+      </w:r>
+    </w:p>
+    <w:p>
+      <w:r>
+        <w:rPr>
+          <w:rFonts w:ascii="Calibri" w:hAnsi="Calibri"/>
+          <w:sz w:val="20"/>
+        </w:rPr>
+        <w:t>Commit: ce20721.</w:t>
+      </w:r>
+    </w:p>
+    <w:p>
+      <w:r>
+        <w:rPr>
+          <w:rFonts w:ascii="Calibri" w:hAnsi="Calibri"/>
+          <w:b/>
+          <w:sz w:val="24"/>
+        </w:rPr>
+        <w:t>R-03 (MAJOR): Discount behavior must be explicit</w:t>
+      </w:r>
+    </w:p>
+    <w:p>
+      <w:r>
+        <w:rPr>
+          <w:rFonts w:ascii="Calibri" w:hAnsi="Calibri"/>
+          <w:sz w:val="20"/>
+        </w:rPr>
+        <w:t>Decision &amp; Fix: Policy decision: benefits follow the tier. Active cardholders enjoy the CURRENT discountPercentage of their tier for new registrations. Existing package registrations snapshot originalPrice, discountPercentage, and paidAmount at registration time and are never recalculated. Documented explicitly in code comments on getApplicableDiscountPercentage, in the AI Audit Log, and in test cases.</w:t>
+      </w:r>
+    </w:p>
+    <w:p>
+      <w:r>
+        <w:rPr>
+          <w:rFonts w:ascii="Calibri" w:hAnsi="Calibri"/>
+          <w:sz w:val="20"/>
+        </w:rPr>
+        <w:t>Files touched: backend/src/main/java/com/sportify/catalog/service/impl/MembershipCardServiceImpl.java, backend/src/test/java/com/sportify/catalog/service/MembershipCardServiceImplTest.java.</w:t>
+      </w:r>
+    </w:p>
+    <w:p>
+      <w:r>
+        <w:rPr>
+          <w:rFonts w:ascii="Calibri" w:hAnsi="Calibri"/>
+          <w:sz w:val="20"/>
+        </w:rPr>
+        <w:t>Commit: ce20721.</w:t>
+      </w:r>
+    </w:p>
+    <w:p>
+      <w:r>
+        <w:rPr>
+          <w:rFonts w:ascii="Calibri" w:hAnsi="Calibri"/>
+          <w:b/>
+          <w:sz w:val="24"/>
+        </w:rPr>
+        <w:t>R-04 (MAJOR): Length and precision validation</w:t>
+      </w:r>
+    </w:p>
+    <w:p>
+      <w:r>
+        <w:rPr>
+          <w:rFonts w:ascii="Calibri" w:hAnsi="Calibri"/>
+          <w:sz w:val="20"/>
+        </w:rPr>
+        <w:t>Problem: Update DTOs lacked character length and numeric precision validation annotations.</w:t>
+      </w:r>
+    </w:p>
+    <w:p>
+      <w:r>
+        <w:rPr>
+          <w:rFonts w:ascii="Calibri" w:hAnsi="Calibri"/>
+          <w:sz w:val="20"/>
+        </w:rPr>
+        <w:t>Fix: Added @Size(max = 50) on tier name, @Size(max = 100) on package name, @Size(max = 500) on description, @Digits(integer = 12, fraction = 2) on price, and @DecimalMin('0.00') on tier price in both update DTOs. Paid tier price &gt; 0 is enforced in service layer to permit STANDARD price 0.</w:t>
+      </w:r>
+    </w:p>
+    <w:p>
+      <w:r>
+        <w:rPr>
+          <w:rFonts w:ascii="Calibri" w:hAnsi="Calibri"/>
+          <w:sz w:val="20"/>
+        </w:rPr>
+        <w:t>Files touched: backend/src/main/java/com/sportify/catalog/dto/SportPackageUpdateRequest.java, backend/src/main/java/com/sportify/catalog/dto/MembershipCardTierUpdateRequest.java, backend/src/test/java/com/sportify/catalog/controller/ManagerPackageControllerTest.java, backend/src/test/java/com/sportify/catalog/controller/ManagerCardTierControllerTest.java.</w:t>
+      </w:r>
+    </w:p>
+    <w:p>
+      <w:r>
+        <w:rPr>
+          <w:rFonts w:ascii="Calibri" w:hAnsi="Calibri"/>
+          <w:sz w:val="20"/>
+        </w:rPr>
+        <w:t>Commit: 8b7faf7.</w:t>
+      </w:r>
+    </w:p>
+    <w:p>
+      <w:r>
+        <w:rPr>
+          <w:rFonts w:ascii="Calibri" w:hAnsi="Calibri"/>
+          <w:b/>
+          <w:sz w:val="24"/>
+        </w:rPr>
+        <w:t>R-05 (MAJOR): Real test evidence and integration tests</w:t>
+      </w:r>
+    </w:p>
+    <w:p>
+      <w:r>
+        <w:rPr>
+          <w:rFonts w:ascii="Calibri" w:hAnsi="Calibri"/>
+          <w:sz w:val="20"/>
+        </w:rPr>
+        <w:t>Problem: Missing integration test coverage for catalog filters, audit logging, and price snapshots; unit tests asserted only mock interactions.</w:t>
+      </w:r>
+    </w:p>
+    <w:p>
+      <w:r>
+        <w:rPr>
+          <w:rFonts w:ascii="Calibri" w:hAnsi="Calibri"/>
+          <w:sz w:val="20"/>
+        </w:rPr>
+        <w:t>Fix: Created ManagerCatalogIntegrationTest extending AbstractIntegrationTest covering: (1) SportPackageSpecifications filters (sportId, format, active, no filter, combined); (2) package update persistence with activity_log before/after snapshot; (3) tier update persistence with activity_log before/after snapshot; (4) end-to-end historical price snapshot preservation across package and tier price updates. Strengthened unit tests in SportPackageServiceImplTest and MembershipCardServiceImplTest with verifyNoInteractions.</w:t>
+      </w:r>
+    </w:p>
+    <w:p>
+      <w:r>
+        <w:rPr>
+          <w:rFonts w:ascii="Calibri" w:hAnsi="Calibri"/>
+          <w:sz w:val="20"/>
+        </w:rPr>
+        <w:t>Test status: Locally skipped due to lack of Docker daemon; verified to skip cleanly with 0 failures.</w:t>
+      </w:r>
+    </w:p>
+    <w:p>
+      <w:r>
+        <w:rPr>
+          <w:rFonts w:ascii="Calibri" w:hAnsi="Calibri"/>
+          <w:sz w:val="20"/>
+        </w:rPr>
+        <w:t>Files touched: backend/src/test/java/com/sportify/catalog/controller/ManagerCatalogIntegrationTest.java, backend/src/test/java/com/sportify/catalog/service/SportPackageServiceImplTest.java, backend/src/test/java/com/sportify/catalog/service/MembershipCardServiceImplTest.java.</w:t>
+      </w:r>
+    </w:p>
+    <w:p>
+      <w:r>
+        <w:rPr>
+          <w:rFonts w:ascii="Calibri" w:hAnsi="Calibri"/>
+          <w:sz w:val="20"/>
+        </w:rPr>
+        <w:t>Commit: 0c38b37.</w:t>
+      </w:r>
+    </w:p>
+    <w:p>
+      <w:r>
+        <w:rPr>
+          <w:rFonts w:ascii="Calibri" w:hAnsi="Calibri"/>
+          <w:b/>
+          <w:sz w:val="24"/>
+        </w:rPr>
+        <w:t>R-06 (MEDIUM): Scope creep removal</w:t>
+      </w:r>
+    </w:p>
+    <w:p>
+      <w:r>
+        <w:rPr>
+          <w:rFonts w:ascii="Calibri" w:hAnsi="Calibri"/>
+          <w:sz w:val="20"/>
+        </w:rPr>
+        <w:t>Problem: Redundant routes PUT /api/v1/manager/packages/{id} and PUT /api/v1/manager/card-tiers/{id}, alias accessors, and extra editable fields.</w:t>
+      </w:r>
+    </w:p>
+    <w:p>
+      <w:r>
+        <w:rPr>
+          <w:rFonts w:ascii="Calibri" w:hAnsi="Calibri"/>
+          <w:sz w:val="20"/>
+        </w:rPr>
+        <w:t>Fix: Removed duplicate PUT routes from ManagerPackageController and ManagerCardTierController. Removed alias accessors (getIsActive, setIsActive, getPriceAmount, setPriceAmount) and @JsonAlias from DTOs. Frontend scanned: no consumers of removed routes or accessors found. Tier name and package description editing were kept because they are required by Figma overlay screens F1-02 and F1-03 (documented in docs/database/13-figma-schema-gap-analysis.md).</w:t>
+      </w:r>
+    </w:p>
+    <w:p>
+      <w:r>
+        <w:rPr>
+          <w:rFonts w:ascii="Calibri" w:hAnsi="Calibri"/>
+          <w:sz w:val="20"/>
+        </w:rPr>
+        <w:t>Files touched: backend/src/main/java/com/sportify/catalog/controller/ManagerPackageController.java, backend/src/main/java/com/sportify/catalog/controller/ManagerCardTierController.java, backend/src/main/java/com/sportify/catalog/dto/SportPackageUpdateRequest.java, backend/src/main/java/com/sportify/catalog/dto/MembershipCardTierUpdateRequest.java, backend/src/test/java/com/sportify/catalog/controller/ManagerPackageControllerTest.java, backend/src/test/java/com/sportify/catalog/controller/ManagerCardTierControllerTest.java.</w:t>
+      </w:r>
+    </w:p>
+    <w:p>
+      <w:r>
+        <w:rPr>
+          <w:rFonts w:ascii="Calibri" w:hAnsi="Calibri"/>
+          <w:sz w:val="20"/>
+        </w:rPr>
+        <w:t>Commit: 8b7faf7, dce3300.</w:t>
+      </w:r>
+    </w:p>
+    <w:p>
+      <w:r>
+        <w:rPr>
+          <w:rFonts w:ascii="Calibri" w:hAnsi="Calibri"/>
+          <w:b/>
+          <w:sz w:val="24"/>
+        </w:rPr>
+        <w:t>R-07 (MEDIUM): Null actor ternary check removal</w:t>
+      </w:r>
+    </w:p>
+    <w:p>
+      <w:r>
+        <w:rPr>
+          <w:rFonts w:ascii="Calibri" w:hAnsi="Calibri"/>
+          <w:sz w:val="20"/>
+        </w:rPr>
+        <w:t>Problem: Ternary check userDetails != null ? userDetails.getUserAccount() : null in PUT handlers was redundant since Spring Security guarantees authenticated principal for secured routes.</w:t>
+      </w:r>
+    </w:p>
+    <w:p>
+      <w:r>
+        <w:rPr>
+          <w:rFonts w:ascii="Calibri" w:hAnsi="Calibri"/>
+          <w:sz w:val="20"/>
+        </w:rPr>
+        <w:t>Fix: Replaced with userDetails.getUserAccount() in SportPackageController and MembershipCardController.</w:t>
+      </w:r>
+    </w:p>
+    <w:p>
+      <w:r>
+        <w:rPr>
+          <w:rFonts w:ascii="Calibri" w:hAnsi="Calibri"/>
+          <w:sz w:val="20"/>
+        </w:rPr>
+        <w:t>Files touched: backend/src/main/java/com/sportify/catalog/controller/SportPackageController.java, backend/src/main/java/com/sportify/catalog/controller/MembershipCardController.java.</w:t>
+      </w:r>
+    </w:p>
+    <w:p>
+      <w:r>
+        <w:rPr>
+          <w:rFonts w:ascii="Calibri" w:hAnsi="Calibri"/>
+          <w:sz w:val="20"/>
+        </w:rPr>
+        <w:t>Commit: dce3300.</w:t>
+      </w:r>
+    </w:p>
+    <w:p>
+      <w:r>
+        <w:rPr>
+          <w:rFonts w:ascii="Calibri" w:hAnsi="Calibri"/>
+          <w:b/>
+          <w:sz w:val="24"/>
+        </w:rPr>
+        <w:t>R-08 (MEDIUM): Single definition of STANDARD</w:t>
+      </w:r>
+    </w:p>
+    <w:p>
+      <w:r>
+        <w:rPr>
+          <w:rFonts w:ascii="Calibri" w:hAnsi="Calibri"/>
+          <w:sz w:val="20"/>
+        </w:rPr>
+        <w:t>Problem: Inconsistent hardcoded 'STANDARD' tier checks across card service methods.</w:t>
+      </w:r>
+    </w:p>
+    <w:p>
+      <w:r>
+        <w:rPr>
+          <w:rFonts w:ascii="Calibri" w:hAnsi="Calibri"/>
+          <w:sz w:val="20"/>
+        </w:rPr>
+        <w:t>Fix: Introduced STANDARD_TIER_CODE = 'STANDARD' constant and private helper isStandard(tier). Applied across updateTier and purchaseCard to guarantee invariants (STANDARD durationMonths 0, price 0; paid tiers durationMonths &gt;= 1).</w:t>
+      </w:r>
+    </w:p>
+    <w:p>
+      <w:r>
+        <w:rPr>
+          <w:rFonts w:ascii="Calibri" w:hAnsi="Calibri"/>
+          <w:sz w:val="20"/>
+        </w:rPr>
+        <w:t>Files touched: backend/src/main/java/com/sportify/catalog/service/impl/MembershipCardServiceImpl.java.</w:t>
+      </w:r>
+    </w:p>
+    <w:p>
+      <w:r>
+        <w:rPr>
+          <w:rFonts w:ascii="Calibri" w:hAnsi="Calibri"/>
+          <w:sz w:val="20"/>
+        </w:rPr>
+        <w:t>Commit: f588ec5.</w:t>
+      </w:r>
+    </w:p>
+    <w:p>
+      <w:r>
+        <w:rPr>
+          <w:rFonts w:ascii="Calibri" w:hAnsi="Calibri"/>
+          <w:b/>
+          <w:sz w:val="24"/>
+        </w:rPr>
+        <w:t>R-09 (MINOR): Duplicated validation clean-up</w:t>
+      </w:r>
+    </w:p>
+    <w:p>
+      <w:r>
+        <w:rPr>
+          <w:rFonts w:ascii="Calibri" w:hAnsi="Calibri"/>
+          <w:sz w:val="20"/>
+        </w:rPr>
+        <w:t>Problem: Validation logic was duplicated between DTO annotations and service layer null checks.</w:t>
+      </w:r>
+    </w:p>
+    <w:p>
+      <w:r>
+        <w:rPr>
+          <w:rFonts w:ascii="Calibri" w:hAnsi="Calibri"/>
+          <w:sz w:val="20"/>
+        </w:rPr>
+        <w:t>Fix: Kept format and structural rules (null, size, digits, range) in DTO annotations. Kept domain invariants and cross-field rules (STANDARD invariants, paid tier price &gt; 0, session minutes 60 or 90) in service layer. Removed dead null checks in service.</w:t>
+      </w:r>
+    </w:p>
+    <w:p>
+      <w:r>
+        <w:rPr>
+          <w:rFonts w:ascii="Calibri" w:hAnsi="Calibri"/>
+          <w:sz w:val="20"/>
+        </w:rPr>
+        <w:t>Files touched: backend/src/main/java/com/sportify/catalog/dto/SportPackageUpdateRequest.java, backend/src/main/java/com/sportify/catalog/dto/MembershipCardTierUpdateRequest.java, backend/src/main/java/com/sportify/catalog/service/impl/SportPackageServiceImpl.java, backend/src/main/java/com/sportify/catalog/service/impl/MembershipCardServiceImpl.java.</w:t>
+      </w:r>
+    </w:p>
+    <w:p>
+      <w:r>
+        <w:rPr>
+          <w:rFonts w:ascii="Calibri" w:hAnsi="Calibri"/>
+          <w:sz w:val="20"/>
+        </w:rPr>
+        <w:t>Commit: f588ec5, 8b7faf7.</w:t>
+      </w:r>
+    </w:p>
+    <w:p>
+      <w:r>
+        <w:rPr>
+          <w:rFonts w:ascii="Calibri" w:hAnsi="Calibri"/>
+          <w:b/>
+          <w:sz w:val="24"/>
+        </w:rPr>
+        <w:t>R-10 (MINOR): Optimistic locking documentation</w:t>
+      </w:r>
+    </w:p>
+    <w:p>
+      <w:r>
+        <w:rPr>
+          <w:rFonts w:ascii="Calibri" w:hAnsi="Calibri"/>
+          <w:sz w:val="20"/>
+        </w:rPr>
+        <w:t>Problem: Entities lack @Version field for optimistic concurrency control.</w:t>
+      </w:r>
+    </w:p>
+    <w:p>
+      <w:r>
+        <w:rPr>
+          <w:rFonts w:ascii="Calibri" w:hAnsi="Calibri"/>
+          <w:sz w:val="20"/>
+        </w:rPr>
+        <w:t>Decision: Limitation documented as an accepted risk under Assumptions and Open Issues: concurrent edits are last-write-wins, follow-up ticket recommended. Entities were intentionally not modified to avoid breaking changes.</w:t>
+      </w:r>
+    </w:p>
+    <w:p>
+      <w:r>
+        <w:rPr>
+          <w:rFonts w:ascii="Calibri" w:hAnsi="Calibri"/>
+          <w:sz w:val="20"/>
+        </w:rPr>
+        <w:t>Files touched: docs/ai-audit/BE-03_AI_Audit_Log.md, docs/ai-audit/BE-03_AI_Audit_Log.docx.</w:t>
+      </w:r>
+    </w:p>
+    <w:p>
+      <w:r>
+        <w:rPr>
+          <w:rFonts w:ascii="Calibri" w:hAnsi="Calibri"/>
+          <w:sz w:val="20"/>
+        </w:rPr>
+        <w:t>Commit: 6cc092b.</w:t>
+      </w:r>
+    </w:p>
+    <w:p>
+      <w:r>
+        <w:rPr>
+          <w:rFonts w:ascii="Calibri" w:hAnsi="Calibri"/>
+          <w:b/>
+          <w:sz w:val="24"/>
+        </w:rPr>
+        <w:t>R-11 (MINOR): PUT description full-replace semantics</w:t>
+      </w:r>
+    </w:p>
+    <w:p>
+      <w:r>
+        <w:rPr>
+          <w:rFonts w:ascii="Calibri" w:hAnsi="Calibri"/>
+          <w:sz w:val="20"/>
+        </w:rPr>
+        <w:t>Problem: Description update semantics were ambiguous.</w:t>
+      </w:r>
+    </w:p>
+    <w:p>
+      <w:r>
+        <w:rPr>
+          <w:rFonts w:ascii="Calibri" w:hAnsi="Calibri"/>
+          <w:sz w:val="20"/>
+        </w:rPr>
+        <w:t>Decision &amp; Fix: Implemented full-replace semantics across both package and tier updates: a null or blank string clears the description in the database to null. Documented in code comments, AI Audit Log, and test cases.</w:t>
+      </w:r>
+    </w:p>
+    <w:p>
+      <w:r>
+        <w:rPr>
+          <w:rFonts w:ascii="Calibri" w:hAnsi="Calibri"/>
+          <w:sz w:val="20"/>
+        </w:rPr>
+        <w:t>Files touched: backend/src/main/java/com/sportify/catalog/service/impl/SportPackageServiceImpl.java, backend/src/main/java/com/sportify/catalog/service/impl/MembershipCardServiceImpl.java, backend/src/test/java/com/sportify/catalog/service/SportPackageServiceImplTest.java, backend/src/test/java/com/sportify/catalog/service/MembershipCardServiceImplTest.java.</w:t>
+      </w:r>
+    </w:p>
+    <w:p>
+      <w:r>
+        <w:rPr>
+          <w:rFonts w:ascii="Calibri" w:hAnsi="Calibri"/>
+          <w:sz w:val="20"/>
+        </w:rPr>
+        <w:t>Commit: 8b7faf7.</w:t>
+      </w:r>
+    </w:p>
+    <w:p>
+      <w:r>
+        <w:rPr>
+          <w:rFonts w:ascii="Calibri" w:hAnsi="Calibri"/>
+          <w:b/>
+          <w:sz w:val="24"/>
+        </w:rPr>
+        <w:t>R-12 (NIT): Direct TrainingFormat binding and import order</w:t>
+      </w:r>
+    </w:p>
+    <w:p>
+      <w:r>
+        <w:rPr>
+          <w:rFonts w:ascii="Calibri" w:hAnsi="Calibri"/>
+          <w:sz w:val="20"/>
+        </w:rPr>
+        <w:t>Problem: Controller manually parsed format query parameter; messy import order in services.</w:t>
+      </w:r>
+    </w:p>
+    <w:p>
+      <w:r>
+        <w:rPr>
+          <w:rFonts w:ascii="Calibri" w:hAnsi="Calibri"/>
+          <w:sz w:val="20"/>
+        </w:rPr>
+        <w:t>Fix: Bound format query parameter directly as TrainingFormat in ManagerPackageController. MethodArgumentTypeMismatchException is handled by GlobalExceptionHandler returning HTTP 400. Tidied imports alphabetically in SportPackageServiceImpl and MembershipCardServiceImpl.</w:t>
+      </w:r>
+    </w:p>
+    <w:p>
+      <w:r>
+        <w:rPr>
+          <w:rFonts w:ascii="Calibri" w:hAnsi="Calibri"/>
+          <w:sz w:val="20"/>
+        </w:rPr>
+        <w:t>Files touched: backend/src/main/java/com/sportify/catalog/controller/ManagerPackageController.java, backend/src/main/java/com/sportify/catalog/service/impl/SportPackageServiceImpl.java, backend/src/main/java/com/sportify/catalog/service/impl/MembershipCardServiceImpl.java.</w:t>
+      </w:r>
+    </w:p>
+    <w:p>
+      <w:r>
+        <w:rPr>
+          <w:rFonts w:ascii="Calibri" w:hAnsi="Calibri"/>
+          <w:sz w:val="20"/>
+        </w:rPr>
+        <w:t>Commit: dce3300.</w:t>
+      </w:r>
+    </w:p>
+    <w:p>
+      <w:r>
+        <w:rPr>
+          <w:rFonts w:ascii="Calibri" w:hAnsi="Calibri"/>
+          <w:b/>
+          <w:sz w:val="24"/>
+        </w:rPr>
+        <w:t>R-13 (DOC): Documentation stale hash and open issues update</w:t>
+      </w:r>
+    </w:p>
+    <w:p>
+      <w:r>
+        <w:rPr>
+          <w:rFonts w:ascii="Calibri" w:hAnsi="Calibri"/>
+          <w:sz w:val="20"/>
+        </w:rPr>
+        <w:t>Problem: Commit 4 hash was recorded as 392f067 instead of real hash dbe924f; Open Issues stated None.</w:t>
+      </w:r>
+    </w:p>
+    <w:p>
+      <w:r>
+        <w:rPr>
+          <w:rFonts w:ascii="Calibri" w:hAnsi="Calibri"/>
+          <w:sz w:val="20"/>
+        </w:rPr>
+        <w:t>Fix: Corrected Commit 4 hash to dbe924f, updated Open Issues with R-10 accepted risk, and added Section 9 Review Fixes.</w:t>
+      </w:r>
+    </w:p>
+    <w:p>
+      <w:r>
+        <w:rPr>
+          <w:rFonts w:ascii="Calibri" w:hAnsi="Calibri"/>
+          <w:sz w:val="20"/>
+        </w:rPr>
+        <w:t>Files touched: docs/ai-audit/BE-03_AI_Audit_Log.docx, docs/ai-audit/BE-03_AI_Audit_Log.md, docs/tests/BE-03_test_cases.md.</w:t>
+      </w:r>
+    </w:p>
+    <w:p>
+      <w:r>
+        <w:rPr>
+          <w:rFonts w:ascii="Calibri" w:hAnsi="Calibri"/>
+          <w:sz w:val="20"/>
+        </w:rPr>
+        <w:t>Commit: 6cc092b.</w:t>
       </w:r>
     </w:p>
     <w:sectPr>

</xml_diff>